<commit_message>
Foto für Bericht 2 ergänzen: feste Station im Detail
Das vom Nutzer bereitgestellte 3D-Modell zeigt genau die Ecke, die
Absatz 9 von Bericht 2 beschreibt: Materialregal (Mitte), Lochwände
(rechts), Schränke (links) und der Schweißtisch davor. Bild zugeschnitten
(Bildunterschrift-Leiste entfernt, die im Word-Bericht ohnehin per
ABBILDUNGEN-Text gesetzt wird) und unter
projekte/projekt-4/img/feste-station-ecke-3d.jpg abgelegt.

In bau_berichtsdaten.py bei ABBILDUNGEN[2] eingetragen, nach Absatz 9.
Damit haben jetzt alle 5 Berichte mindestens eine Abbildung (Minimum
laut Infoveranstaltung war 3).

Co-Authored-By: Claude Sonnet 5 <noreply@anthropic.com>
Claude-Session: https://claude.ai/code/session_01U4BNk3uadsQpTDXBqWzPi1
</commit_message>
<xml_diff>
--- a/hochschule/Hassine_3399727_Bericht.docx
+++ b/hochschule/Hassine_3399727_Bericht.docx
@@ -2179,362 +2179,13 @@
     </w:p>
     <w:p>
       <w:pPr>
-        <w:spacing w:after="160" w:line="276"/>
-      </w:pPr>
-      <w:r>
-        <w:rPr>
-          <w:rFonts w:ascii="Arial" w:cs="Arial" w:eastAsia="Arial" w:hAnsi="Arial"/>
-          <w:b w:val="false"/>
-          <w:bCs w:val="false"/>
-          <w:i w:val="false"/>
-          <w:iCs w:val="false"/>
-          <w:sz w:val="22"/>
-          <w:szCs w:val="22"/>
-        </w:rPr>
-        <w:t xml:space="preserve">Durch diese Tätigkeit lernte ich, wie ein Arbeitsplatz als Ganzes geplant wird und wie eng Werkzeugbedarf, Anordnung, Ordnung und Sicherheit zusammenhängen. Mir wurde deutlich, dass Arbeitssicherheit keine nachträgliche Prüfung ist, sondern sich aus Planungsentscheidungen ergibt: Ob ein Feuerlöscher erreichbar ist oder die Wege frei bleiben, entscheidet sich im Layout und nicht in der Gefährdungsbeurteilung.</w:t>
-      </w:r>
-    </w:p>
-    <w:p>
-      <w:pPr>
-        <w:spacing w:after="160" w:line="276"/>
-      </w:pPr>
-      <w:r>
-        <w:rPr>
-          <w:rFonts w:ascii="Arial" w:cs="Arial" w:eastAsia="Arial" w:hAnsi="Arial"/>
-          <w:b w:val="false"/>
-          <w:bCs w:val="false"/>
-          <w:i/>
-          <w:iCs/>
-          <w:color w:val="595959"/>
-          <w:sz w:val="22"/>
-          <w:szCs w:val="22"/>
-        </w:rPr>
-        <w:t xml:space="preserve">Dieser Abschnitt wird ausschließlich im Fließtext beschrieben; aus dem Betrieb liegen dazu keine verwertbaren Bilddateien vor.</w:t>
-      </w:r>
-    </w:p>
-    <w:tbl>
-      <w:tblPr>
-        <w:tblW w:type="dxa" w:w="9062"/>
-        <w:tblBorders>
-          <w:top w:val="single" w:color="000000" w:sz="6"/>
-          <w:left w:val="single" w:color="000000" w:sz="6"/>
-          <w:bottom w:val="single" w:color="000000" w:sz="6"/>
-          <w:right w:val="single" w:color="000000" w:sz="6"/>
-          <w:insideH w:val="single" w:color="auto" w:sz="4"/>
-          <w:insideV w:val="single" w:color="auto" w:sz="4"/>
-        </w:tblBorders>
-      </w:tblPr>
-      <w:tblGrid>
-        <w:gridCol w:w="9062"/>
-      </w:tblGrid>
-      <w:tr>
-        <w:tc>
-          <w:tcPr>
-            <w:tcW w:type="dxa" w:w="9062"/>
-          </w:tcPr>
-          <w:p>
-            <w:pPr>
-              <w:spacing w:after="0" w:line="276"/>
-            </w:pPr>
-            <w:r>
-              <w:rPr>
-                <w:rFonts w:ascii="Arial" w:cs="Arial" w:eastAsia="Arial" w:hAnsi="Arial"/>
-                <w:b w:val="false"/>
-                <w:bCs w:val="false"/>
-                <w:i/>
-                <w:iCs/>
-                <w:sz w:val="22"/>
-                <w:szCs w:val="22"/>
-              </w:rPr>
-              <w:t xml:space="preserve">Ende Tätigkeitsbericht 2</w:t>
-            </w:r>
-          </w:p>
-        </w:tc>
-      </w:tr>
-    </w:tbl>
-    <w:p>
-      <w:r>
-        <w:br w:type="page"/>
-      </w:r>
-    </w:p>
-    <w:tbl>
-      <w:tblPr>
-        <w:tblW w:type="dxa" w:w="9062"/>
-        <w:tblBorders>
-          <w:top w:val="none" w:color="FFFFFF" w:sz="0"/>
-          <w:left w:val="none" w:color="FFFFFF" w:sz="0"/>
-          <w:bottom w:val="none" w:color="FFFFFF" w:sz="0"/>
-          <w:right w:val="none" w:color="FFFFFF" w:sz="0"/>
-          <w:insideH w:val="single" w:color="auto" w:sz="4"/>
-          <w:insideV w:val="single" w:color="auto" w:sz="4"/>
-        </w:tblBorders>
-      </w:tblPr>
-      <w:tblGrid>
-        <w:gridCol w:w="5457"/>
-        <w:gridCol w:w="3605"/>
-      </w:tblGrid>
-      <w:tr>
-        <w:tc>
-          <w:tcPr>
-            <w:tcW w:type="dxa" w:w="9062"/>
-            <w:gridSpan w:val="2"/>
-            <w:tcBorders>
-              <w:top w:val="none" w:color="FFFFFF" w:sz="0"/>
-              <w:left w:val="none" w:color="FFFFFF" w:sz="0"/>
-              <w:bottom w:val="none" w:color="FFFFFF" w:sz="0"/>
-              <w:right w:val="none" w:color="FFFFFF" w:sz="0"/>
-            </w:tcBorders>
-            <w:shd w:fill="D9D9D9" w:val="clear"/>
-          </w:tcPr>
-          <w:p>
-            <w:pPr>
-              <w:spacing w:after="60" w:line="276"/>
-            </w:pPr>
-            <w:r>
-              <w:rPr>
-                <w:rFonts w:ascii="Arial" w:cs="Arial" w:eastAsia="Arial" w:hAnsi="Arial"/>
-                <w:b/>
-                <w:bCs/>
-                <w:i w:val="false"/>
-                <w:iCs w:val="false"/>
-                <w:sz w:val="22"/>
-                <w:szCs w:val="22"/>
-              </w:rPr>
-              <w:t xml:space="preserve">Tätigkeitsbericht 3</w:t>
-            </w:r>
-          </w:p>
-        </w:tc>
-      </w:tr>
-      <w:tr>
-        <w:tc>
-          <w:tcPr>
-            <w:tcW w:type="dxa" w:w="5457"/>
-            <w:tcBorders>
-              <w:top w:val="none" w:color="FFFFFF" w:sz="0"/>
-              <w:left w:val="none" w:color="FFFFFF" w:sz="0"/>
-              <w:bottom w:val="single" w:color="000000" w:sz="6"/>
-              <w:right w:val="none" w:color="FFFFFF" w:sz="0"/>
-            </w:tcBorders>
-          </w:tcPr>
-          <w:p>
-            <w:pPr>
-              <w:spacing w:after="20" w:line="276"/>
-            </w:pPr>
-            <w:r>
-              <w:rPr>
-                <w:rFonts w:ascii="Arial" w:cs="Arial" w:eastAsia="Arial" w:hAnsi="Arial"/>
-                <w:b w:val="false"/>
-                <w:bCs w:val="false"/>
-                <w:i w:val="false"/>
-                <w:iCs w:val="false"/>
-                <w:sz w:val="22"/>
-                <w:szCs w:val="22"/>
-              </w:rPr>
-              <w:t xml:space="preserve">Konstruktion eines neuen Schweißtisch-Konzepts</w:t>
-            </w:r>
-          </w:p>
-        </w:tc>
-        <w:tc>
-          <w:tcPr>
-            <w:tcW w:type="dxa" w:w="3605"/>
-            <w:tcBorders>
-              <w:top w:val="none" w:color="FFFFFF" w:sz="0"/>
-              <w:left w:val="none" w:color="FFFFFF" w:sz="0"/>
-              <w:bottom w:val="single" w:color="000000" w:sz="6"/>
-              <w:right w:val="none" w:color="FFFFFF" w:sz="0"/>
-            </w:tcBorders>
-          </w:tcPr>
-          <w:p>
-            <w:pPr>
-              <w:spacing w:after="20" w:line="276"/>
-            </w:pPr>
-            <w:r>
-              <w:rPr>
-                <w:rFonts w:ascii="Arial" w:cs="Arial" w:eastAsia="Arial" w:hAnsi="Arial"/>
-                <w:b w:val="false"/>
-                <w:bCs w:val="false"/>
-                <w:i w:val="false"/>
-                <w:iCs w:val="false"/>
-                <w:sz w:val="22"/>
-                <w:szCs w:val="22"/>
-              </w:rPr>
-              <w:t xml:space="preserve">18.05.2026 – 08.06.2026</w:t>
-            </w:r>
-          </w:p>
-        </w:tc>
-      </w:tr>
-      <w:tr>
-        <w:tc>
-          <w:tcPr>
-            <w:tcW w:type="dxa" w:w="5457"/>
-            <w:tcBorders>
-              <w:top w:val="none" w:color="FFFFFF" w:sz="0"/>
-              <w:left w:val="none" w:color="FFFFFF" w:sz="0"/>
-              <w:bottom w:val="none" w:color="FFFFFF" w:sz="0"/>
-              <w:right w:val="none" w:color="FFFFFF" w:sz="0"/>
-            </w:tcBorders>
-          </w:tcPr>
-          <w:p>
-            <w:pPr>
-              <w:spacing w:after="140" w:line="276"/>
-            </w:pPr>
-            <w:r>
-              <w:rPr>
-                <w:rFonts w:ascii="Arial" w:cs="Arial" w:eastAsia="Arial" w:hAnsi="Arial"/>
-                <w:b w:val="false"/>
-                <w:bCs w:val="false"/>
-                <w:i w:val="false"/>
-                <w:iCs w:val="false"/>
-                <w:color w:val="595959"/>
-                <w:sz w:val="16"/>
-                <w:szCs w:val="16"/>
-              </w:rPr>
-              <w:t xml:space="preserve">Bezeichnung der Tätigkeit</w:t>
-            </w:r>
-          </w:p>
-        </w:tc>
-        <w:tc>
-          <w:tcPr>
-            <w:tcW w:type="dxa" w:w="3605"/>
-            <w:tcBorders>
-              <w:top w:val="none" w:color="FFFFFF" w:sz="0"/>
-              <w:left w:val="none" w:color="FFFFFF" w:sz="0"/>
-              <w:bottom w:val="none" w:color="FFFFFF" w:sz="0"/>
-              <w:right w:val="none" w:color="FFFFFF" w:sz="0"/>
-            </w:tcBorders>
-          </w:tcPr>
-          <w:p>
-            <w:pPr>
-              <w:spacing w:after="140" w:line="276"/>
-            </w:pPr>
-            <w:r>
-              <w:rPr>
-                <w:rFonts w:ascii="Arial" w:cs="Arial" w:eastAsia="Arial" w:hAnsi="Arial"/>
-                <w:b w:val="false"/>
-                <w:bCs w:val="false"/>
-                <w:i w:val="false"/>
-                <w:iCs w:val="false"/>
-                <w:color w:val="595959"/>
-                <w:sz w:val="16"/>
-                <w:szCs w:val="16"/>
-              </w:rPr>
-              <w:t xml:space="preserve">Zeitraum</w:t>
-            </w:r>
-          </w:p>
-        </w:tc>
-      </w:tr>
-    </w:tbl>
-    <w:p>
-      <w:pPr>
-        <w:spacing w:after="120" w:line="276"/>
-      </w:pPr>
-      <w:r>
-        <w:rPr>
-          <w:rFonts w:ascii="Arial" w:cs="Arial" w:eastAsia="Arial" w:hAnsi="Arial"/>
-          <w:b w:val="false"/>
-          <w:bCs w:val="false"/>
-          <w:i w:val="false"/>
-          <w:iCs w:val="false"/>
-          <w:sz w:val="22"/>
-          <w:szCs w:val="22"/>
-        </w:rPr>
-        <w:t xml:space="preserve"/>
-      </w:r>
-    </w:p>
-    <w:p>
-      <w:pPr>
-        <w:spacing w:after="160" w:line="276"/>
-      </w:pPr>
-      <w:r>
-        <w:rPr>
-          <w:rFonts w:ascii="Arial" w:cs="Arial" w:eastAsia="Arial" w:hAnsi="Arial"/>
-          <w:b w:val="false"/>
-          <w:bCs w:val="false"/>
-          <w:i w:val="false"/>
-          <w:iCs w:val="false"/>
-          <w:sz w:val="22"/>
-          <w:szCs w:val="22"/>
-        </w:rPr>
-        <w:t xml:space="preserve">Aufbauend auf der Planung des Schweißarbeitsplatzes konstruierte ich einen neuen Schweißtisch. Der vorhandene Tisch war für lange Bauteile zu klein und bot keine flexiblen Spannmöglichkeiten. Ziel war ein Tisch, der lange Werkstücke aufnehmen kann, im Normalzustand aber nicht mehr Platz beansprucht als bisher, und der ein Spannsystem für wechselnde Aufspannungen bietet.</w:t>
-      </w:r>
-    </w:p>
-    <w:p>
-      <w:pPr>
-        <w:spacing w:after="160" w:line="276"/>
-      </w:pPr>
-      <w:r>
-        <w:rPr>
-          <w:rFonts w:ascii="Arial" w:cs="Arial" w:eastAsia="Arial" w:hAnsi="Arial"/>
-          <w:b w:val="false"/>
-          <w:bCs w:val="false"/>
-          <w:i w:val="false"/>
-          <w:iCs w:val="false"/>
-          <w:sz w:val="22"/>
-          <w:szCs w:val="22"/>
-        </w:rPr>
-        <w:t xml:space="preserve">Zu Beginn sammelte ich gemeinsam mit meinem Betreuer die Anforderungen und vermaß den vorhandenen Tisch. Zusätzlich nahm ich auf, welche Schwachstellen im Alltag auftreten. Anschließend recherchierte ich bestehende Schweißtisch-Konzepte und Spannsysteme, sammelte Beispiele und bewertete sie hinsichtlich Aufwand und Nutzen für unseren Betrieb.</w:t>
-      </w:r>
-    </w:p>
-    <w:p>
-      <w:pPr>
-        <w:spacing w:after="160" w:line="276"/>
-      </w:pPr>
-      <w:r>
-        <w:rPr>
-          <w:rFonts w:ascii="Arial" w:cs="Arial" w:eastAsia="Arial" w:hAnsi="Arial"/>
-          <w:b w:val="false"/>
-          <w:bCs w:val="false"/>
-          <w:i w:val="false"/>
-          <w:iCs w:val="false"/>
-          <w:sz w:val="22"/>
-          <w:szCs w:val="22"/>
-        </w:rPr>
-        <w:t xml:space="preserve">Auf dieser Grundlage fertigte ich erste Handskizzen an und besprach sie mit meinem Betreuer. Als Grundkonzept legten wir einen beidseitig ausziehbaren Tisch mit Lochplatten-Spannsystem auf einem fahrbaren Untergestell fest. Damit lassen sich lange Teile aufspannen, ohne dass der Tisch dauerhaft die entsprechende Fläche belegt.</w:t>
-      </w:r>
-    </w:p>
-    <w:p>
-      <w:pPr>
-        <w:spacing w:after="160" w:line="276"/>
-      </w:pPr>
-      <w:r>
-        <w:rPr>
-          <w:rFonts w:ascii="Arial" w:cs="Arial" w:eastAsia="Arial" w:hAnsi="Arial"/>
-          <w:b w:val="false"/>
-          <w:bCs w:val="false"/>
-          <w:i w:val="false"/>
-          <w:iCs w:val="false"/>
-          <w:sz w:val="22"/>
-          <w:szCs w:val="22"/>
-        </w:rPr>
-        <w:t xml:space="preserve">Für das Spannsystem führte ich eine Marktrecherche zu Lochplatten durch. Ich verglich mehrere Angebote hinsichtlich Lochraster, Plattenstärke, Werkstoff und Preis und wählte ein Raster mit 16 mm Bohrungsdurchmesser aus. Dieses Raster ist im Markt verbreitet, sodass Spannmittel und Vorrichtungen als Zukaufteile verfügbar sind.</w:t>
-      </w:r>
-    </w:p>
-    <w:p>
-      <w:pPr>
-        <w:spacing w:after="160" w:line="276"/>
-      </w:pPr>
-      <w:r>
-        <w:rPr>
-          <w:rFonts w:ascii="Arial" w:cs="Arial" w:eastAsia="Arial" w:hAnsi="Arial"/>
-          <w:b w:val="false"/>
-          <w:bCs w:val="false"/>
-          <w:i w:val="false"/>
-          <w:iCs w:val="false"/>
-          <w:sz w:val="22"/>
-          <w:szCs w:val="22"/>
-        </w:rPr>
-        <w:t xml:space="preserve">Anschließend begann ich mit der CAD-Konstruktion. Zuerst baute ich die Tischplatte mit dem Lochraster auf. Danach konstruierte ich das Oberteil mit Trägern und Profilen sowie das Unterteil mit Beinen, Streben und Fußplatten. Für jedes Bauteil vergab ich eine Teilenummer, um die spätere Zuordnung in den Stücklisten sicherzustellen.</w:t>
-      </w:r>
-    </w:p>
-    <w:p>
-      <w:pPr>
         <w:spacing w:after="60" w:before="120"/>
         <w:jc w:val="center"/>
       </w:pPr>
       <w:r>
         <w:drawing>
           <wp:inline distT="0" distB="0" distL="0" distR="0">
-            <wp:extent cx="4572000" cy="2038350"/>
+            <wp:extent cx="4572000" cy="2857500"/>
             <wp:effectExtent t="0" r="0" b="0" l="0"/>
             <wp:docPr id="1" name="" descr="" title=""/>
             <wp:cNvGraphicFramePr>
@@ -2559,7 +2210,7 @@
                   <pic:spPr bwMode="auto">
                     <a:xfrm>
                       <a:off x="0" y="0"/>
-                      <a:ext cx="4572000" cy="2038350"/>
+                      <a:ext cx="4572000" cy="2857500"/>
                     </a:xfrm>
                     <a:prstGeom prst="rect">
                       <a:avLst/>
@@ -2587,24 +2238,338 @@
           <w:sz w:val="18"/>
           <w:szCs w:val="18"/>
         </w:rPr>
-        <w:t xml:space="preserve">Abbildung 3.1: Lochplatten-Spannsystem auf dem Tischrahmen</w:t>
-      </w:r>
-    </w:p>
-    <w:p>
-      <w:pPr>
-        <w:spacing w:after="160" w:line="276"/>
-      </w:pPr>
-      <w:r>
-        <w:rPr>
-          <w:rFonts w:ascii="Arial" w:cs="Arial" w:eastAsia="Arial" w:hAnsi="Arial"/>
-          <w:b w:val="false"/>
-          <w:bCs w:val="false"/>
-          <w:i w:val="false"/>
-          <w:iCs w:val="false"/>
-          <w:sz w:val="22"/>
-          <w:szCs w:val="22"/>
-        </w:rPr>
-        <w:t xml:space="preserve">Ein eigener Konstruktionsschwerpunkt war das Erweiterungssystem. Ich führte es als Teleskop-Rahmen aus, der sich beidseitig ausziehen lässt. Nach dem Zusammenführen aller Baugruppen zum Gesamtzusammenbau prüfte ich im Modell die Verfahrwege und mögliche Kollisionen und passte die Führungen entsprechend an.</w:t>
+        <w:t xml:space="preserve">Abbildung 2.1: Ecke mit Materialregal (Mitte), Lochwänden (rechts), Schränken (links) und Schweißtisch</w:t>
+      </w:r>
+    </w:p>
+    <w:p>
+      <w:pPr>
+        <w:spacing w:after="160" w:line="276"/>
+      </w:pPr>
+      <w:r>
+        <w:rPr>
+          <w:rFonts w:ascii="Arial" w:cs="Arial" w:eastAsia="Arial" w:hAnsi="Arial"/>
+          <w:b w:val="false"/>
+          <w:bCs w:val="false"/>
+          <w:i w:val="false"/>
+          <w:iCs w:val="false"/>
+          <w:sz w:val="22"/>
+          <w:szCs w:val="22"/>
+        </w:rPr>
+        <w:t xml:space="preserve">Durch diese Tätigkeit lernte ich, wie ein Arbeitsplatz als Ganzes geplant wird und wie eng Werkzeugbedarf, Anordnung, Ordnung und Sicherheit zusammenhängen. Mir wurde deutlich, dass Arbeitssicherheit keine nachträgliche Prüfung ist, sondern sich aus Planungsentscheidungen ergibt: Ob ein Feuerlöscher erreichbar ist oder die Wege frei bleiben, entscheidet sich im Layout und nicht in der Gefährdungsbeurteilung.</w:t>
+      </w:r>
+    </w:p>
+    <w:tbl>
+      <w:tblPr>
+        <w:tblW w:type="dxa" w:w="9062"/>
+        <w:tblBorders>
+          <w:top w:val="single" w:color="000000" w:sz="6"/>
+          <w:left w:val="single" w:color="000000" w:sz="6"/>
+          <w:bottom w:val="single" w:color="000000" w:sz="6"/>
+          <w:right w:val="single" w:color="000000" w:sz="6"/>
+          <w:insideH w:val="single" w:color="auto" w:sz="4"/>
+          <w:insideV w:val="single" w:color="auto" w:sz="4"/>
+        </w:tblBorders>
+      </w:tblPr>
+      <w:tblGrid>
+        <w:gridCol w:w="9062"/>
+      </w:tblGrid>
+      <w:tr>
+        <w:tc>
+          <w:tcPr>
+            <w:tcW w:type="dxa" w:w="9062"/>
+          </w:tcPr>
+          <w:p>
+            <w:pPr>
+              <w:spacing w:after="0" w:line="276"/>
+            </w:pPr>
+            <w:r>
+              <w:rPr>
+                <w:rFonts w:ascii="Arial" w:cs="Arial" w:eastAsia="Arial" w:hAnsi="Arial"/>
+                <w:b w:val="false"/>
+                <w:bCs w:val="false"/>
+                <w:i/>
+                <w:iCs/>
+                <w:sz w:val="22"/>
+                <w:szCs w:val="22"/>
+              </w:rPr>
+              <w:t xml:space="preserve">Ende Tätigkeitsbericht 2</w:t>
+            </w:r>
+          </w:p>
+        </w:tc>
+      </w:tr>
+    </w:tbl>
+    <w:p>
+      <w:r>
+        <w:br w:type="page"/>
+      </w:r>
+    </w:p>
+    <w:tbl>
+      <w:tblPr>
+        <w:tblW w:type="dxa" w:w="9062"/>
+        <w:tblBorders>
+          <w:top w:val="none" w:color="FFFFFF" w:sz="0"/>
+          <w:left w:val="none" w:color="FFFFFF" w:sz="0"/>
+          <w:bottom w:val="none" w:color="FFFFFF" w:sz="0"/>
+          <w:right w:val="none" w:color="FFFFFF" w:sz="0"/>
+          <w:insideH w:val="single" w:color="auto" w:sz="4"/>
+          <w:insideV w:val="single" w:color="auto" w:sz="4"/>
+        </w:tblBorders>
+      </w:tblPr>
+      <w:tblGrid>
+        <w:gridCol w:w="5457"/>
+        <w:gridCol w:w="3605"/>
+      </w:tblGrid>
+      <w:tr>
+        <w:tc>
+          <w:tcPr>
+            <w:tcW w:type="dxa" w:w="9062"/>
+            <w:gridSpan w:val="2"/>
+            <w:tcBorders>
+              <w:top w:val="none" w:color="FFFFFF" w:sz="0"/>
+              <w:left w:val="none" w:color="FFFFFF" w:sz="0"/>
+              <w:bottom w:val="none" w:color="FFFFFF" w:sz="0"/>
+              <w:right w:val="none" w:color="FFFFFF" w:sz="0"/>
+            </w:tcBorders>
+            <w:shd w:fill="D9D9D9" w:val="clear"/>
+          </w:tcPr>
+          <w:p>
+            <w:pPr>
+              <w:spacing w:after="60" w:line="276"/>
+            </w:pPr>
+            <w:r>
+              <w:rPr>
+                <w:rFonts w:ascii="Arial" w:cs="Arial" w:eastAsia="Arial" w:hAnsi="Arial"/>
+                <w:b/>
+                <w:bCs/>
+                <w:i w:val="false"/>
+                <w:iCs w:val="false"/>
+                <w:sz w:val="22"/>
+                <w:szCs w:val="22"/>
+              </w:rPr>
+              <w:t xml:space="preserve">Tätigkeitsbericht 3</w:t>
+            </w:r>
+          </w:p>
+        </w:tc>
+      </w:tr>
+      <w:tr>
+        <w:tc>
+          <w:tcPr>
+            <w:tcW w:type="dxa" w:w="5457"/>
+            <w:tcBorders>
+              <w:top w:val="none" w:color="FFFFFF" w:sz="0"/>
+              <w:left w:val="none" w:color="FFFFFF" w:sz="0"/>
+              <w:bottom w:val="single" w:color="000000" w:sz="6"/>
+              <w:right w:val="none" w:color="FFFFFF" w:sz="0"/>
+            </w:tcBorders>
+          </w:tcPr>
+          <w:p>
+            <w:pPr>
+              <w:spacing w:after="20" w:line="276"/>
+            </w:pPr>
+            <w:r>
+              <w:rPr>
+                <w:rFonts w:ascii="Arial" w:cs="Arial" w:eastAsia="Arial" w:hAnsi="Arial"/>
+                <w:b w:val="false"/>
+                <w:bCs w:val="false"/>
+                <w:i w:val="false"/>
+                <w:iCs w:val="false"/>
+                <w:sz w:val="22"/>
+                <w:szCs w:val="22"/>
+              </w:rPr>
+              <w:t xml:space="preserve">Konstruktion eines neuen Schweißtisch-Konzepts</w:t>
+            </w:r>
+          </w:p>
+        </w:tc>
+        <w:tc>
+          <w:tcPr>
+            <w:tcW w:type="dxa" w:w="3605"/>
+            <w:tcBorders>
+              <w:top w:val="none" w:color="FFFFFF" w:sz="0"/>
+              <w:left w:val="none" w:color="FFFFFF" w:sz="0"/>
+              <w:bottom w:val="single" w:color="000000" w:sz="6"/>
+              <w:right w:val="none" w:color="FFFFFF" w:sz="0"/>
+            </w:tcBorders>
+          </w:tcPr>
+          <w:p>
+            <w:pPr>
+              <w:spacing w:after="20" w:line="276"/>
+            </w:pPr>
+            <w:r>
+              <w:rPr>
+                <w:rFonts w:ascii="Arial" w:cs="Arial" w:eastAsia="Arial" w:hAnsi="Arial"/>
+                <w:b w:val="false"/>
+                <w:bCs w:val="false"/>
+                <w:i w:val="false"/>
+                <w:iCs w:val="false"/>
+                <w:sz w:val="22"/>
+                <w:szCs w:val="22"/>
+              </w:rPr>
+              <w:t xml:space="preserve">18.05.2026 – 08.06.2026</w:t>
+            </w:r>
+          </w:p>
+        </w:tc>
+      </w:tr>
+      <w:tr>
+        <w:tc>
+          <w:tcPr>
+            <w:tcW w:type="dxa" w:w="5457"/>
+            <w:tcBorders>
+              <w:top w:val="none" w:color="FFFFFF" w:sz="0"/>
+              <w:left w:val="none" w:color="FFFFFF" w:sz="0"/>
+              <w:bottom w:val="none" w:color="FFFFFF" w:sz="0"/>
+              <w:right w:val="none" w:color="FFFFFF" w:sz="0"/>
+            </w:tcBorders>
+          </w:tcPr>
+          <w:p>
+            <w:pPr>
+              <w:spacing w:after="140" w:line="276"/>
+            </w:pPr>
+            <w:r>
+              <w:rPr>
+                <w:rFonts w:ascii="Arial" w:cs="Arial" w:eastAsia="Arial" w:hAnsi="Arial"/>
+                <w:b w:val="false"/>
+                <w:bCs w:val="false"/>
+                <w:i w:val="false"/>
+                <w:iCs w:val="false"/>
+                <w:color w:val="595959"/>
+                <w:sz w:val="16"/>
+                <w:szCs w:val="16"/>
+              </w:rPr>
+              <w:t xml:space="preserve">Bezeichnung der Tätigkeit</w:t>
+            </w:r>
+          </w:p>
+        </w:tc>
+        <w:tc>
+          <w:tcPr>
+            <w:tcW w:type="dxa" w:w="3605"/>
+            <w:tcBorders>
+              <w:top w:val="none" w:color="FFFFFF" w:sz="0"/>
+              <w:left w:val="none" w:color="FFFFFF" w:sz="0"/>
+              <w:bottom w:val="none" w:color="FFFFFF" w:sz="0"/>
+              <w:right w:val="none" w:color="FFFFFF" w:sz="0"/>
+            </w:tcBorders>
+          </w:tcPr>
+          <w:p>
+            <w:pPr>
+              <w:spacing w:after="140" w:line="276"/>
+            </w:pPr>
+            <w:r>
+              <w:rPr>
+                <w:rFonts w:ascii="Arial" w:cs="Arial" w:eastAsia="Arial" w:hAnsi="Arial"/>
+                <w:b w:val="false"/>
+                <w:bCs w:val="false"/>
+                <w:i w:val="false"/>
+                <w:iCs w:val="false"/>
+                <w:color w:val="595959"/>
+                <w:sz w:val="16"/>
+                <w:szCs w:val="16"/>
+              </w:rPr>
+              <w:t xml:space="preserve">Zeitraum</w:t>
+            </w:r>
+          </w:p>
+        </w:tc>
+      </w:tr>
+    </w:tbl>
+    <w:p>
+      <w:pPr>
+        <w:spacing w:after="120" w:line="276"/>
+      </w:pPr>
+      <w:r>
+        <w:rPr>
+          <w:rFonts w:ascii="Arial" w:cs="Arial" w:eastAsia="Arial" w:hAnsi="Arial"/>
+          <w:b w:val="false"/>
+          <w:bCs w:val="false"/>
+          <w:i w:val="false"/>
+          <w:iCs w:val="false"/>
+          <w:sz w:val="22"/>
+          <w:szCs w:val="22"/>
+        </w:rPr>
+        <w:t xml:space="preserve"/>
+      </w:r>
+    </w:p>
+    <w:p>
+      <w:pPr>
+        <w:spacing w:after="160" w:line="276"/>
+      </w:pPr>
+      <w:r>
+        <w:rPr>
+          <w:rFonts w:ascii="Arial" w:cs="Arial" w:eastAsia="Arial" w:hAnsi="Arial"/>
+          <w:b w:val="false"/>
+          <w:bCs w:val="false"/>
+          <w:i w:val="false"/>
+          <w:iCs w:val="false"/>
+          <w:sz w:val="22"/>
+          <w:szCs w:val="22"/>
+        </w:rPr>
+        <w:t xml:space="preserve">Aufbauend auf der Planung des Schweißarbeitsplatzes konstruierte ich einen neuen Schweißtisch. Der vorhandene Tisch war für lange Bauteile zu klein und bot keine flexiblen Spannmöglichkeiten. Ziel war ein Tisch, der lange Werkstücke aufnehmen kann, im Normalzustand aber nicht mehr Platz beansprucht als bisher, und der ein Spannsystem für wechselnde Aufspannungen bietet.</w:t>
+      </w:r>
+    </w:p>
+    <w:p>
+      <w:pPr>
+        <w:spacing w:after="160" w:line="276"/>
+      </w:pPr>
+      <w:r>
+        <w:rPr>
+          <w:rFonts w:ascii="Arial" w:cs="Arial" w:eastAsia="Arial" w:hAnsi="Arial"/>
+          <w:b w:val="false"/>
+          <w:bCs w:val="false"/>
+          <w:i w:val="false"/>
+          <w:iCs w:val="false"/>
+          <w:sz w:val="22"/>
+          <w:szCs w:val="22"/>
+        </w:rPr>
+        <w:t xml:space="preserve">Zu Beginn sammelte ich gemeinsam mit meinem Betreuer die Anforderungen und vermaß den vorhandenen Tisch. Zusätzlich nahm ich auf, welche Schwachstellen im Alltag auftreten. Anschließend recherchierte ich bestehende Schweißtisch-Konzepte und Spannsysteme, sammelte Beispiele und bewertete sie hinsichtlich Aufwand und Nutzen für unseren Betrieb.</w:t>
+      </w:r>
+    </w:p>
+    <w:p>
+      <w:pPr>
+        <w:spacing w:after="160" w:line="276"/>
+      </w:pPr>
+      <w:r>
+        <w:rPr>
+          <w:rFonts w:ascii="Arial" w:cs="Arial" w:eastAsia="Arial" w:hAnsi="Arial"/>
+          <w:b w:val="false"/>
+          <w:bCs w:val="false"/>
+          <w:i w:val="false"/>
+          <w:iCs w:val="false"/>
+          <w:sz w:val="22"/>
+          <w:szCs w:val="22"/>
+        </w:rPr>
+        <w:t xml:space="preserve">Auf dieser Grundlage fertigte ich erste Handskizzen an und besprach sie mit meinem Betreuer. Als Grundkonzept legten wir einen beidseitig ausziehbaren Tisch mit Lochplatten-Spannsystem auf einem fahrbaren Untergestell fest. Damit lassen sich lange Teile aufspannen, ohne dass der Tisch dauerhaft die entsprechende Fläche belegt.</w:t>
+      </w:r>
+    </w:p>
+    <w:p>
+      <w:pPr>
+        <w:spacing w:after="160" w:line="276"/>
+      </w:pPr>
+      <w:r>
+        <w:rPr>
+          <w:rFonts w:ascii="Arial" w:cs="Arial" w:eastAsia="Arial" w:hAnsi="Arial"/>
+          <w:b w:val="false"/>
+          <w:bCs w:val="false"/>
+          <w:i w:val="false"/>
+          <w:iCs w:val="false"/>
+          <w:sz w:val="22"/>
+          <w:szCs w:val="22"/>
+        </w:rPr>
+        <w:t xml:space="preserve">Für das Spannsystem führte ich eine Marktrecherche zu Lochplatten durch. Ich verglich mehrere Angebote hinsichtlich Lochraster, Plattenstärke, Werkstoff und Preis und wählte ein Raster mit 16 mm Bohrungsdurchmesser aus. Dieses Raster ist im Markt verbreitet, sodass Spannmittel und Vorrichtungen als Zukaufteile verfügbar sind.</w:t>
+      </w:r>
+    </w:p>
+    <w:p>
+      <w:pPr>
+        <w:spacing w:after="160" w:line="276"/>
+      </w:pPr>
+      <w:r>
+        <w:rPr>
+          <w:rFonts w:ascii="Arial" w:cs="Arial" w:eastAsia="Arial" w:hAnsi="Arial"/>
+          <w:b w:val="false"/>
+          <w:bCs w:val="false"/>
+          <w:i w:val="false"/>
+          <w:iCs w:val="false"/>
+          <w:sz w:val="22"/>
+          <w:szCs w:val="22"/>
+        </w:rPr>
+        <w:t xml:space="preserve">Anschließend begann ich mit der CAD-Konstruktion. Zuerst baute ich die Tischplatte mit dem Lochraster auf. Danach konstruierte ich das Oberteil mit Trägern und Profilen sowie das Unterteil mit Beinen, Streben und Fußplatten. Für jedes Bauteil vergab ich eine Teilenummer, um die spätere Zuordnung in den Stücklisten sicherzustellen.</w:t>
       </w:r>
     </w:p>
     <w:p>
@@ -2615,7 +2580,7 @@
       <w:r>
         <w:drawing>
           <wp:inline distT="0" distB="0" distL="0" distR="0">
-            <wp:extent cx="4572000" cy="2876550"/>
+            <wp:extent cx="4572000" cy="2038350"/>
             <wp:effectExtent t="0" r="0" b="0" l="0"/>
             <wp:docPr id="1" name="" descr="" title=""/>
             <wp:cNvGraphicFramePr>
@@ -2640,7 +2605,7 @@
                   <pic:spPr bwMode="auto">
                     <a:xfrm>
                       <a:off x="0" y="0"/>
-                      <a:ext cx="4572000" cy="2876550"/>
+                      <a:ext cx="4572000" cy="2038350"/>
                     </a:xfrm>
                     <a:prstGeom prst="rect">
                       <a:avLst/>
@@ -2668,24 +2633,24 @@
           <w:sz w:val="18"/>
           <w:szCs w:val="18"/>
         </w:rPr>
-        <w:t xml:space="preserve">Abbildung 3.2: 3D-Modell des Schweißtisches im Gesamtzusammenbau</w:t>
-      </w:r>
-    </w:p>
-    <w:p>
-      <w:pPr>
-        <w:spacing w:after="160" w:line="276"/>
-      </w:pPr>
-      <w:r>
-        <w:rPr>
-          <w:rFonts w:ascii="Arial" w:cs="Arial" w:eastAsia="Arial" w:hAnsi="Arial"/>
-          <w:b w:val="false"/>
-          <w:bCs w:val="false"/>
-          <w:i w:val="false"/>
-          <w:iCs w:val="false"/>
-          <w:sz w:val="22"/>
-          <w:szCs w:val="22"/>
-        </w:rPr>
-        <w:t xml:space="preserve">Aus dem Modell leitete ich anschließend die Zeichnungen ab. Ich erstellte Einzelteil- und Baugruppenzeichnungen, bemaßte sie und füllte die Schriftfelder aus. Parallel entstanden die Stücklisten, in denen ich die Zukaufteile kennzeichnete. Aus den Stücklisten leitete ich den Materialbedarf ab und stellte die benötigten Rohrlängen zusammen. Zusätzlich legte ich die Lenkrollen aus und prüfte ihre Tragfähigkeit gegen das errechnete Gesamtgewicht.</w:t>
+        <w:t xml:space="preserve">Abbildung 3.1: Lochplatten-Spannsystem auf dem Tischrahmen</w:t>
+      </w:r>
+    </w:p>
+    <w:p>
+      <w:pPr>
+        <w:spacing w:after="160" w:line="276"/>
+      </w:pPr>
+      <w:r>
+        <w:rPr>
+          <w:rFonts w:ascii="Arial" w:cs="Arial" w:eastAsia="Arial" w:hAnsi="Arial"/>
+          <w:b w:val="false"/>
+          <w:bCs w:val="false"/>
+          <w:i w:val="false"/>
+          <w:iCs w:val="false"/>
+          <w:sz w:val="22"/>
+          <w:szCs w:val="22"/>
+        </w:rPr>
+        <w:t xml:space="preserve">Ein eigener Konstruktionsschwerpunkt war das Erweiterungssystem. Ich führte es als Teleskop-Rahmen aus, der sich beidseitig ausziehen lässt. Nach dem Zusammenführen aller Baugruppen zum Gesamtzusammenbau prüfte ich im Modell die Verfahrwege und mögliche Kollisionen und passte die Führungen entsprechend an.</w:t>
       </w:r>
     </w:p>
     <w:p>
@@ -2696,7 +2661,7 @@
       <w:r>
         <w:drawing>
           <wp:inline distT="0" distB="0" distL="0" distR="0">
-            <wp:extent cx="2562225" cy="3619500"/>
+            <wp:extent cx="4572000" cy="2876550"/>
             <wp:effectExtent t="0" r="0" b="0" l="0"/>
             <wp:docPr id="1" name="" descr="" title=""/>
             <wp:cNvGraphicFramePr>
@@ -2721,7 +2686,7 @@
                   <pic:spPr bwMode="auto">
                     <a:xfrm>
                       <a:off x="0" y="0"/>
-                      <a:ext cx="2562225" cy="3619500"/>
+                      <a:ext cx="4572000" cy="2876550"/>
                     </a:xfrm>
                     <a:prstGeom prst="rect">
                       <a:avLst/>
@@ -2749,321 +2714,24 @@
           <w:sz w:val="18"/>
           <w:szCs w:val="18"/>
         </w:rPr>
-        <w:t xml:space="preserve">Abbildung 3.3: Zeichnungsblatt des Endstands mit Schriftfeld</w:t>
-      </w:r>
-    </w:p>
-    <w:p>
-      <w:pPr>
-        <w:spacing w:after="160" w:line="276"/>
-      </w:pPr>
-      <w:r>
-        <w:rPr>
-          <w:rFonts w:ascii="Arial" w:cs="Arial" w:eastAsia="Arial" w:hAnsi="Arial"/>
-          <w:b w:val="false"/>
-          <w:bCs w:val="false"/>
-          <w:i w:val="false"/>
-          <w:iCs w:val="false"/>
-          <w:sz w:val="22"/>
-          <w:szCs w:val="22"/>
-        </w:rPr>
-        <w:t xml:space="preserve">Bevor ich den Zeichnungssatz weitergab, prüfte ich ihn systematisch selbst. Dabei fielen mir Abweichungen bei den Gewichtsangaben auf. Ich rechnete die Gewichte einzelner Teile aus Querschnitt, Länge und Dichte nach und stellte fest, dass dasselbe Bauteil an zwei Stellen mit unterschiedlichen Gewichten geführt war. Bei der weiteren Durchsicht fand ich zusätzlich einen Längenwiderspruch sowie Baugruppen, die ohne Gewichtsangabe ausgewiesen waren. Insgesamt dokumentierte ich fünf belegte Fehler.</w:t>
-      </w:r>
-    </w:p>
-    <w:p>
-      <w:pPr>
-        <w:spacing w:after="160" w:line="276"/>
-      </w:pPr>
-      <w:r>
-        <w:rPr>
-          <w:rFonts w:ascii="Arial" w:cs="Arial" w:eastAsia="Arial" w:hAnsi="Arial"/>
-          <w:b w:val="false"/>
-          <w:bCs w:val="false"/>
-          <w:i w:val="false"/>
-          <w:iCs w:val="false"/>
-          <w:sz w:val="22"/>
-          <w:szCs w:val="22"/>
-        </w:rPr>
-        <w:t xml:space="preserve">Alle gefundenen Fehler arbeitete ich anschließend im CAD-Modell und in den Stücklisten ein. Aus dem korrigierten Stand erstellte ich die Hauptstückliste neu und ergänzte für jede Position, ob sie selbst gefertigt oder zugekauft wird. Den korrigierten Zeichnungssatz besprach ich mit meinem Betreuer und übergab ihn zur Prüfung.</w:t>
-      </w:r>
-    </w:p>
-    <w:p>
-      <w:pPr>
-        <w:spacing w:after="160" w:line="276"/>
-      </w:pPr>
-      <w:r>
-        <w:rPr>
-          <w:rFonts w:ascii="Arial" w:cs="Arial" w:eastAsia="Arial" w:hAnsi="Arial"/>
-          <w:b w:val="false"/>
-          <w:bCs w:val="false"/>
-          <w:i w:val="false"/>
-          <w:iCs w:val="false"/>
-          <w:sz w:val="22"/>
-          <w:szCs w:val="22"/>
-        </w:rPr>
-        <w:t xml:space="preserve">Durch diese Tätigkeit erhielt ich einen umfassenden Einblick in den Ablauf einer Konstruktion von der Anforderungsaufnahme über das CAD-Modell bis zum fertigungsreifen Zeichnungssatz. Die wichtigste Erfahrung war die eigene Prüfung: Das Modell sah lange fertig aus, und erst das Nachrechnen der Gewichte machte sichtbar, dass es das noch nicht war.</w:t>
-      </w:r>
-    </w:p>
-    <w:tbl>
-      <w:tblPr>
-        <w:tblW w:type="dxa" w:w="9062"/>
-        <w:tblBorders>
-          <w:top w:val="single" w:color="000000" w:sz="6"/>
-          <w:left w:val="single" w:color="000000" w:sz="6"/>
-          <w:bottom w:val="single" w:color="000000" w:sz="6"/>
-          <w:right w:val="single" w:color="000000" w:sz="6"/>
-          <w:insideH w:val="single" w:color="auto" w:sz="4"/>
-          <w:insideV w:val="single" w:color="auto" w:sz="4"/>
-        </w:tblBorders>
-      </w:tblPr>
-      <w:tblGrid>
-        <w:gridCol w:w="9062"/>
-      </w:tblGrid>
-      <w:tr>
-        <w:tc>
-          <w:tcPr>
-            <w:tcW w:type="dxa" w:w="9062"/>
-          </w:tcPr>
-          <w:p>
-            <w:pPr>
-              <w:spacing w:after="0" w:line="276"/>
-            </w:pPr>
-            <w:r>
-              <w:rPr>
-                <w:rFonts w:ascii="Arial" w:cs="Arial" w:eastAsia="Arial" w:hAnsi="Arial"/>
-                <w:b w:val="false"/>
-                <w:bCs w:val="false"/>
-                <w:i/>
-                <w:iCs/>
-                <w:sz w:val="22"/>
-                <w:szCs w:val="22"/>
-              </w:rPr>
-              <w:t xml:space="preserve">Ende Tätigkeitsbericht 3</w:t>
-            </w:r>
-          </w:p>
-        </w:tc>
-      </w:tr>
-    </w:tbl>
-    <w:p>
-      <w:r>
-        <w:br w:type="page"/>
-      </w:r>
-    </w:p>
-    <w:tbl>
-      <w:tblPr>
-        <w:tblW w:type="dxa" w:w="9062"/>
-        <w:tblBorders>
-          <w:top w:val="none" w:color="FFFFFF" w:sz="0"/>
-          <w:left w:val="none" w:color="FFFFFF" w:sz="0"/>
-          <w:bottom w:val="none" w:color="FFFFFF" w:sz="0"/>
-          <w:right w:val="none" w:color="FFFFFF" w:sz="0"/>
-          <w:insideH w:val="single" w:color="auto" w:sz="4"/>
-          <w:insideV w:val="single" w:color="auto" w:sz="4"/>
-        </w:tblBorders>
-      </w:tblPr>
-      <w:tblGrid>
-        <w:gridCol w:w="5457"/>
-        <w:gridCol w:w="3605"/>
-      </w:tblGrid>
-      <w:tr>
-        <w:tc>
-          <w:tcPr>
-            <w:tcW w:type="dxa" w:w="9062"/>
-            <w:gridSpan w:val="2"/>
-            <w:tcBorders>
-              <w:top w:val="none" w:color="FFFFFF" w:sz="0"/>
-              <w:left w:val="none" w:color="FFFFFF" w:sz="0"/>
-              <w:bottom w:val="none" w:color="FFFFFF" w:sz="0"/>
-              <w:right w:val="none" w:color="FFFFFF" w:sz="0"/>
-            </w:tcBorders>
-            <w:shd w:fill="D9D9D9" w:val="clear"/>
-          </w:tcPr>
-          <w:p>
-            <w:pPr>
-              <w:spacing w:after="60" w:line="276"/>
-            </w:pPr>
-            <w:r>
-              <w:rPr>
-                <w:rFonts w:ascii="Arial" w:cs="Arial" w:eastAsia="Arial" w:hAnsi="Arial"/>
-                <w:b/>
-                <w:bCs/>
-                <w:i w:val="false"/>
-                <w:iCs w:val="false"/>
-                <w:sz w:val="22"/>
-                <w:szCs w:val="22"/>
-              </w:rPr>
-              <w:t xml:space="preserve">Tätigkeitsbericht 4</w:t>
-            </w:r>
-          </w:p>
-        </w:tc>
-      </w:tr>
-      <w:tr>
-        <w:tc>
-          <w:tcPr>
-            <w:tcW w:type="dxa" w:w="5457"/>
-            <w:tcBorders>
-              <w:top w:val="none" w:color="FFFFFF" w:sz="0"/>
-              <w:left w:val="none" w:color="FFFFFF" w:sz="0"/>
-              <w:bottom w:val="single" w:color="000000" w:sz="6"/>
-              <w:right w:val="none" w:color="FFFFFF" w:sz="0"/>
-            </w:tcBorders>
-          </w:tcPr>
-          <w:p>
-            <w:pPr>
-              <w:spacing w:after="20" w:line="276"/>
-            </w:pPr>
-            <w:r>
-              <w:rPr>
-                <w:rFonts w:ascii="Arial" w:cs="Arial" w:eastAsia="Arial" w:hAnsi="Arial"/>
-                <w:b w:val="false"/>
-                <w:bCs w:val="false"/>
-                <w:i w:val="false"/>
-                <w:iCs w:val="false"/>
-                <w:sz w:val="22"/>
-                <w:szCs w:val="22"/>
-              </w:rPr>
-              <w:t xml:space="preserve">Optimierung des Schweißmaschinen-Wagens und der Werkzeugplätze nach 5S</w:t>
-            </w:r>
-          </w:p>
-        </w:tc>
-        <w:tc>
-          <w:tcPr>
-            <w:tcW w:type="dxa" w:w="3605"/>
-            <w:tcBorders>
-              <w:top w:val="none" w:color="FFFFFF" w:sz="0"/>
-              <w:left w:val="none" w:color="FFFFFF" w:sz="0"/>
-              <w:bottom w:val="single" w:color="000000" w:sz="6"/>
-              <w:right w:val="none" w:color="FFFFFF" w:sz="0"/>
-            </w:tcBorders>
-          </w:tcPr>
-          <w:p>
-            <w:pPr>
-              <w:spacing w:after="20" w:line="276"/>
-            </w:pPr>
-            <w:r>
-              <w:rPr>
-                <w:rFonts w:ascii="Arial" w:cs="Arial" w:eastAsia="Arial" w:hAnsi="Arial"/>
-                <w:b w:val="false"/>
-                <w:bCs w:val="false"/>
-                <w:i w:val="false"/>
-                <w:iCs w:val="false"/>
-                <w:sz w:val="22"/>
-                <w:szCs w:val="22"/>
-              </w:rPr>
-              <w:t xml:space="preserve">09.06.2026 – 25.06.2026</w:t>
-            </w:r>
-          </w:p>
-        </w:tc>
-      </w:tr>
-      <w:tr>
-        <w:tc>
-          <w:tcPr>
-            <w:tcW w:type="dxa" w:w="5457"/>
-            <w:tcBorders>
-              <w:top w:val="none" w:color="FFFFFF" w:sz="0"/>
-              <w:left w:val="none" w:color="FFFFFF" w:sz="0"/>
-              <w:bottom w:val="none" w:color="FFFFFF" w:sz="0"/>
-              <w:right w:val="none" w:color="FFFFFF" w:sz="0"/>
-            </w:tcBorders>
-          </w:tcPr>
-          <w:p>
-            <w:pPr>
-              <w:spacing w:after="140" w:line="276"/>
-            </w:pPr>
-            <w:r>
-              <w:rPr>
-                <w:rFonts w:ascii="Arial" w:cs="Arial" w:eastAsia="Arial" w:hAnsi="Arial"/>
-                <w:b w:val="false"/>
-                <w:bCs w:val="false"/>
-                <w:i w:val="false"/>
-                <w:iCs w:val="false"/>
-                <w:color w:val="595959"/>
-                <w:sz w:val="16"/>
-                <w:szCs w:val="16"/>
-              </w:rPr>
-              <w:t xml:space="preserve">Bezeichnung der Tätigkeit</w:t>
-            </w:r>
-          </w:p>
-        </w:tc>
-        <w:tc>
-          <w:tcPr>
-            <w:tcW w:type="dxa" w:w="3605"/>
-            <w:tcBorders>
-              <w:top w:val="none" w:color="FFFFFF" w:sz="0"/>
-              <w:left w:val="none" w:color="FFFFFF" w:sz="0"/>
-              <w:bottom w:val="none" w:color="FFFFFF" w:sz="0"/>
-              <w:right w:val="none" w:color="FFFFFF" w:sz="0"/>
-            </w:tcBorders>
-          </w:tcPr>
-          <w:p>
-            <w:pPr>
-              <w:spacing w:after="140" w:line="276"/>
-            </w:pPr>
-            <w:r>
-              <w:rPr>
-                <w:rFonts w:ascii="Arial" w:cs="Arial" w:eastAsia="Arial" w:hAnsi="Arial"/>
-                <w:b w:val="false"/>
-                <w:bCs w:val="false"/>
-                <w:i w:val="false"/>
-                <w:iCs w:val="false"/>
-                <w:color w:val="595959"/>
-                <w:sz w:val="16"/>
-                <w:szCs w:val="16"/>
-              </w:rPr>
-              <w:t xml:space="preserve">Zeitraum</w:t>
-            </w:r>
-          </w:p>
-        </w:tc>
-      </w:tr>
-    </w:tbl>
-    <w:p>
-      <w:pPr>
-        <w:spacing w:after="120" w:line="276"/>
-      </w:pPr>
-      <w:r>
-        <w:rPr>
-          <w:rFonts w:ascii="Arial" w:cs="Arial" w:eastAsia="Arial" w:hAnsi="Arial"/>
-          <w:b w:val="false"/>
-          <w:bCs w:val="false"/>
-          <w:i w:val="false"/>
-          <w:iCs w:val="false"/>
-          <w:sz w:val="22"/>
-          <w:szCs w:val="22"/>
-        </w:rPr>
-        <w:t xml:space="preserve"/>
-      </w:r>
-    </w:p>
-    <w:p>
-      <w:pPr>
-        <w:spacing w:after="160" w:line="276"/>
-      </w:pPr>
-      <w:r>
-        <w:rPr>
-          <w:rFonts w:ascii="Arial" w:cs="Arial" w:eastAsia="Arial" w:hAnsi="Arial"/>
-          <w:b w:val="false"/>
-          <w:bCs w:val="false"/>
-          <w:i w:val="false"/>
-          <w:iCs w:val="false"/>
-          <w:sz w:val="22"/>
-          <w:szCs w:val="22"/>
-        </w:rPr>
-        <w:t xml:space="preserve">Als mobile Ergänzung zur festen Schweißstation befasste ich mich mit der Optimierung des Schweißmaschinen-Wagens. Der Wagen soll Schweißgerät, Gasflasche und die wichtigsten Werkzeuge zum Werkstück bringen, damit nicht das Werkstück zur Maschine transportiert werden muss. Ziel war ein Wagen, auf dem jedes Werkzeug einen festen Platz hat und der die Anforderungen an Standsicherheit und Gasflaschensicherung erfüllt.</w:t>
-      </w:r>
-    </w:p>
-    <w:p>
-      <w:pPr>
-        <w:spacing w:after="160" w:line="276"/>
-      </w:pPr>
-      <w:r>
-        <w:rPr>
-          <w:rFonts w:ascii="Arial" w:cs="Arial" w:eastAsia="Arial" w:hAnsi="Arial"/>
-          <w:b w:val="false"/>
-          <w:bCs w:val="false"/>
-          <w:i w:val="false"/>
-          <w:iCs w:val="false"/>
-          <w:sz w:val="22"/>
-          <w:szCs w:val="22"/>
-        </w:rPr>
-        <w:t xml:space="preserve">Zunächst nahm ich den vorhandenen Wagen auf. Ich fotografierte ihn im Betrieb und dokumentierte seinen Zustand. Anschließend vermaß ich das Schweißgerät und die Gasflasche vor Ort und hielt die Maße in einer Handskizze fest. Aus diesen Maßen erstellte ich vereinfachte CAD-Platzhalter für Gerät und Flasche, um den benötigten Bauraum in den späteren Entwürfen realistisch abzubilden.</w:t>
+        <w:t xml:space="preserve">Abbildung 3.2: 3D-Modell des Schweißtisches im Gesamtzusammenbau</w:t>
+      </w:r>
+    </w:p>
+    <w:p>
+      <w:pPr>
+        <w:spacing w:after="160" w:line="276"/>
+      </w:pPr>
+      <w:r>
+        <w:rPr>
+          <w:rFonts w:ascii="Arial" w:cs="Arial" w:eastAsia="Arial" w:hAnsi="Arial"/>
+          <w:b w:val="false"/>
+          <w:bCs w:val="false"/>
+          <w:i w:val="false"/>
+          <w:iCs w:val="false"/>
+          <w:sz w:val="22"/>
+          <w:szCs w:val="22"/>
+        </w:rPr>
+        <w:t xml:space="preserve">Aus dem Modell leitete ich anschließend die Zeichnungen ab. Ich erstellte Einzelteil- und Baugruppenzeichnungen, bemaßte sie und füllte die Schriftfelder aus. Parallel entstanden die Stücklisten, in denen ich die Zukaufteile kennzeichnete. Aus den Stücklisten leitete ich den Materialbedarf ab und stellte die benötigten Rohrlängen zusammen. Zusätzlich legte ich die Lenkrollen aus und prüfte ihre Tragfähigkeit gegen das errechnete Gesamtgewicht.</w:t>
       </w:r>
     </w:p>
     <w:p>
@@ -3074,7 +2742,7 @@
       <w:r>
         <w:drawing>
           <wp:inline distT="0" distB="0" distL="0" distR="0">
-            <wp:extent cx="2714625" cy="3619500"/>
+            <wp:extent cx="2562225" cy="3619500"/>
             <wp:effectExtent t="0" r="0" b="0" l="0"/>
             <wp:docPr id="1" name="" descr="" title=""/>
             <wp:cNvGraphicFramePr>
@@ -3099,7 +2767,7 @@
                   <pic:spPr bwMode="auto">
                     <a:xfrm>
                       <a:off x="0" y="0"/>
-                      <a:ext cx="2714625" cy="3619500"/>
+                      <a:ext cx="2562225" cy="3619500"/>
                     </a:xfrm>
                     <a:prstGeom prst="rect">
                       <a:avLst/>
@@ -3127,7 +2795,321 @@
           <w:sz w:val="18"/>
           <w:szCs w:val="18"/>
         </w:rPr>
-        <w:t xml:space="preserve">Abbildung 4.1: Vorhandener Schweißwagen im Betrieb</w:t>
+        <w:t xml:space="preserve">Abbildung 3.3: Zeichnungsblatt des Endstands mit Schriftfeld</w:t>
+      </w:r>
+    </w:p>
+    <w:p>
+      <w:pPr>
+        <w:spacing w:after="160" w:line="276"/>
+      </w:pPr>
+      <w:r>
+        <w:rPr>
+          <w:rFonts w:ascii="Arial" w:cs="Arial" w:eastAsia="Arial" w:hAnsi="Arial"/>
+          <w:b w:val="false"/>
+          <w:bCs w:val="false"/>
+          <w:i w:val="false"/>
+          <w:iCs w:val="false"/>
+          <w:sz w:val="22"/>
+          <w:szCs w:val="22"/>
+        </w:rPr>
+        <w:t xml:space="preserve">Bevor ich den Zeichnungssatz weitergab, prüfte ich ihn systematisch selbst. Dabei fielen mir Abweichungen bei den Gewichtsangaben auf. Ich rechnete die Gewichte einzelner Teile aus Querschnitt, Länge und Dichte nach und stellte fest, dass dasselbe Bauteil an zwei Stellen mit unterschiedlichen Gewichten geführt war. Bei der weiteren Durchsicht fand ich zusätzlich einen Längenwiderspruch sowie Baugruppen, die ohne Gewichtsangabe ausgewiesen waren. Insgesamt dokumentierte ich fünf belegte Fehler.</w:t>
+      </w:r>
+    </w:p>
+    <w:p>
+      <w:pPr>
+        <w:spacing w:after="160" w:line="276"/>
+      </w:pPr>
+      <w:r>
+        <w:rPr>
+          <w:rFonts w:ascii="Arial" w:cs="Arial" w:eastAsia="Arial" w:hAnsi="Arial"/>
+          <w:b w:val="false"/>
+          <w:bCs w:val="false"/>
+          <w:i w:val="false"/>
+          <w:iCs w:val="false"/>
+          <w:sz w:val="22"/>
+          <w:szCs w:val="22"/>
+        </w:rPr>
+        <w:t xml:space="preserve">Alle gefundenen Fehler arbeitete ich anschließend im CAD-Modell und in den Stücklisten ein. Aus dem korrigierten Stand erstellte ich die Hauptstückliste neu und ergänzte für jede Position, ob sie selbst gefertigt oder zugekauft wird. Den korrigierten Zeichnungssatz besprach ich mit meinem Betreuer und übergab ihn zur Prüfung.</w:t>
+      </w:r>
+    </w:p>
+    <w:p>
+      <w:pPr>
+        <w:spacing w:after="160" w:line="276"/>
+      </w:pPr>
+      <w:r>
+        <w:rPr>
+          <w:rFonts w:ascii="Arial" w:cs="Arial" w:eastAsia="Arial" w:hAnsi="Arial"/>
+          <w:b w:val="false"/>
+          <w:bCs w:val="false"/>
+          <w:i w:val="false"/>
+          <w:iCs w:val="false"/>
+          <w:sz w:val="22"/>
+          <w:szCs w:val="22"/>
+        </w:rPr>
+        <w:t xml:space="preserve">Durch diese Tätigkeit erhielt ich einen umfassenden Einblick in den Ablauf einer Konstruktion von der Anforderungsaufnahme über das CAD-Modell bis zum fertigungsreifen Zeichnungssatz. Die wichtigste Erfahrung war die eigene Prüfung: Das Modell sah lange fertig aus, und erst das Nachrechnen der Gewichte machte sichtbar, dass es das noch nicht war.</w:t>
+      </w:r>
+    </w:p>
+    <w:tbl>
+      <w:tblPr>
+        <w:tblW w:type="dxa" w:w="9062"/>
+        <w:tblBorders>
+          <w:top w:val="single" w:color="000000" w:sz="6"/>
+          <w:left w:val="single" w:color="000000" w:sz="6"/>
+          <w:bottom w:val="single" w:color="000000" w:sz="6"/>
+          <w:right w:val="single" w:color="000000" w:sz="6"/>
+          <w:insideH w:val="single" w:color="auto" w:sz="4"/>
+          <w:insideV w:val="single" w:color="auto" w:sz="4"/>
+        </w:tblBorders>
+      </w:tblPr>
+      <w:tblGrid>
+        <w:gridCol w:w="9062"/>
+      </w:tblGrid>
+      <w:tr>
+        <w:tc>
+          <w:tcPr>
+            <w:tcW w:type="dxa" w:w="9062"/>
+          </w:tcPr>
+          <w:p>
+            <w:pPr>
+              <w:spacing w:after="0" w:line="276"/>
+            </w:pPr>
+            <w:r>
+              <w:rPr>
+                <w:rFonts w:ascii="Arial" w:cs="Arial" w:eastAsia="Arial" w:hAnsi="Arial"/>
+                <w:b w:val="false"/>
+                <w:bCs w:val="false"/>
+                <w:i/>
+                <w:iCs/>
+                <w:sz w:val="22"/>
+                <w:szCs w:val="22"/>
+              </w:rPr>
+              <w:t xml:space="preserve">Ende Tätigkeitsbericht 3</w:t>
+            </w:r>
+          </w:p>
+        </w:tc>
+      </w:tr>
+    </w:tbl>
+    <w:p>
+      <w:r>
+        <w:br w:type="page"/>
+      </w:r>
+    </w:p>
+    <w:tbl>
+      <w:tblPr>
+        <w:tblW w:type="dxa" w:w="9062"/>
+        <w:tblBorders>
+          <w:top w:val="none" w:color="FFFFFF" w:sz="0"/>
+          <w:left w:val="none" w:color="FFFFFF" w:sz="0"/>
+          <w:bottom w:val="none" w:color="FFFFFF" w:sz="0"/>
+          <w:right w:val="none" w:color="FFFFFF" w:sz="0"/>
+          <w:insideH w:val="single" w:color="auto" w:sz="4"/>
+          <w:insideV w:val="single" w:color="auto" w:sz="4"/>
+        </w:tblBorders>
+      </w:tblPr>
+      <w:tblGrid>
+        <w:gridCol w:w="5457"/>
+        <w:gridCol w:w="3605"/>
+      </w:tblGrid>
+      <w:tr>
+        <w:tc>
+          <w:tcPr>
+            <w:tcW w:type="dxa" w:w="9062"/>
+            <w:gridSpan w:val="2"/>
+            <w:tcBorders>
+              <w:top w:val="none" w:color="FFFFFF" w:sz="0"/>
+              <w:left w:val="none" w:color="FFFFFF" w:sz="0"/>
+              <w:bottom w:val="none" w:color="FFFFFF" w:sz="0"/>
+              <w:right w:val="none" w:color="FFFFFF" w:sz="0"/>
+            </w:tcBorders>
+            <w:shd w:fill="D9D9D9" w:val="clear"/>
+          </w:tcPr>
+          <w:p>
+            <w:pPr>
+              <w:spacing w:after="60" w:line="276"/>
+            </w:pPr>
+            <w:r>
+              <w:rPr>
+                <w:rFonts w:ascii="Arial" w:cs="Arial" w:eastAsia="Arial" w:hAnsi="Arial"/>
+                <w:b/>
+                <w:bCs/>
+                <w:i w:val="false"/>
+                <w:iCs w:val="false"/>
+                <w:sz w:val="22"/>
+                <w:szCs w:val="22"/>
+              </w:rPr>
+              <w:t xml:space="preserve">Tätigkeitsbericht 4</w:t>
+            </w:r>
+          </w:p>
+        </w:tc>
+      </w:tr>
+      <w:tr>
+        <w:tc>
+          <w:tcPr>
+            <w:tcW w:type="dxa" w:w="5457"/>
+            <w:tcBorders>
+              <w:top w:val="none" w:color="FFFFFF" w:sz="0"/>
+              <w:left w:val="none" w:color="FFFFFF" w:sz="0"/>
+              <w:bottom w:val="single" w:color="000000" w:sz="6"/>
+              <w:right w:val="none" w:color="FFFFFF" w:sz="0"/>
+            </w:tcBorders>
+          </w:tcPr>
+          <w:p>
+            <w:pPr>
+              <w:spacing w:after="20" w:line="276"/>
+            </w:pPr>
+            <w:r>
+              <w:rPr>
+                <w:rFonts w:ascii="Arial" w:cs="Arial" w:eastAsia="Arial" w:hAnsi="Arial"/>
+                <w:b w:val="false"/>
+                <w:bCs w:val="false"/>
+                <w:i w:val="false"/>
+                <w:iCs w:val="false"/>
+                <w:sz w:val="22"/>
+                <w:szCs w:val="22"/>
+              </w:rPr>
+              <w:t xml:space="preserve">Optimierung des Schweißmaschinen-Wagens und der Werkzeugplätze nach 5S</w:t>
+            </w:r>
+          </w:p>
+        </w:tc>
+        <w:tc>
+          <w:tcPr>
+            <w:tcW w:type="dxa" w:w="3605"/>
+            <w:tcBorders>
+              <w:top w:val="none" w:color="FFFFFF" w:sz="0"/>
+              <w:left w:val="none" w:color="FFFFFF" w:sz="0"/>
+              <w:bottom w:val="single" w:color="000000" w:sz="6"/>
+              <w:right w:val="none" w:color="FFFFFF" w:sz="0"/>
+            </w:tcBorders>
+          </w:tcPr>
+          <w:p>
+            <w:pPr>
+              <w:spacing w:after="20" w:line="276"/>
+            </w:pPr>
+            <w:r>
+              <w:rPr>
+                <w:rFonts w:ascii="Arial" w:cs="Arial" w:eastAsia="Arial" w:hAnsi="Arial"/>
+                <w:b w:val="false"/>
+                <w:bCs w:val="false"/>
+                <w:i w:val="false"/>
+                <w:iCs w:val="false"/>
+                <w:sz w:val="22"/>
+                <w:szCs w:val="22"/>
+              </w:rPr>
+              <w:t xml:space="preserve">09.06.2026 – 25.06.2026</w:t>
+            </w:r>
+          </w:p>
+        </w:tc>
+      </w:tr>
+      <w:tr>
+        <w:tc>
+          <w:tcPr>
+            <w:tcW w:type="dxa" w:w="5457"/>
+            <w:tcBorders>
+              <w:top w:val="none" w:color="FFFFFF" w:sz="0"/>
+              <w:left w:val="none" w:color="FFFFFF" w:sz="0"/>
+              <w:bottom w:val="none" w:color="FFFFFF" w:sz="0"/>
+              <w:right w:val="none" w:color="FFFFFF" w:sz="0"/>
+            </w:tcBorders>
+          </w:tcPr>
+          <w:p>
+            <w:pPr>
+              <w:spacing w:after="140" w:line="276"/>
+            </w:pPr>
+            <w:r>
+              <w:rPr>
+                <w:rFonts w:ascii="Arial" w:cs="Arial" w:eastAsia="Arial" w:hAnsi="Arial"/>
+                <w:b w:val="false"/>
+                <w:bCs w:val="false"/>
+                <w:i w:val="false"/>
+                <w:iCs w:val="false"/>
+                <w:color w:val="595959"/>
+                <w:sz w:val="16"/>
+                <w:szCs w:val="16"/>
+              </w:rPr>
+              <w:t xml:space="preserve">Bezeichnung der Tätigkeit</w:t>
+            </w:r>
+          </w:p>
+        </w:tc>
+        <w:tc>
+          <w:tcPr>
+            <w:tcW w:type="dxa" w:w="3605"/>
+            <w:tcBorders>
+              <w:top w:val="none" w:color="FFFFFF" w:sz="0"/>
+              <w:left w:val="none" w:color="FFFFFF" w:sz="0"/>
+              <w:bottom w:val="none" w:color="FFFFFF" w:sz="0"/>
+              <w:right w:val="none" w:color="FFFFFF" w:sz="0"/>
+            </w:tcBorders>
+          </w:tcPr>
+          <w:p>
+            <w:pPr>
+              <w:spacing w:after="140" w:line="276"/>
+            </w:pPr>
+            <w:r>
+              <w:rPr>
+                <w:rFonts w:ascii="Arial" w:cs="Arial" w:eastAsia="Arial" w:hAnsi="Arial"/>
+                <w:b w:val="false"/>
+                <w:bCs w:val="false"/>
+                <w:i w:val="false"/>
+                <w:iCs w:val="false"/>
+                <w:color w:val="595959"/>
+                <w:sz w:val="16"/>
+                <w:szCs w:val="16"/>
+              </w:rPr>
+              <w:t xml:space="preserve">Zeitraum</w:t>
+            </w:r>
+          </w:p>
+        </w:tc>
+      </w:tr>
+    </w:tbl>
+    <w:p>
+      <w:pPr>
+        <w:spacing w:after="120" w:line="276"/>
+      </w:pPr>
+      <w:r>
+        <w:rPr>
+          <w:rFonts w:ascii="Arial" w:cs="Arial" w:eastAsia="Arial" w:hAnsi="Arial"/>
+          <w:b w:val="false"/>
+          <w:bCs w:val="false"/>
+          <w:i w:val="false"/>
+          <w:iCs w:val="false"/>
+          <w:sz w:val="22"/>
+          <w:szCs w:val="22"/>
+        </w:rPr>
+        <w:t xml:space="preserve"/>
+      </w:r>
+    </w:p>
+    <w:p>
+      <w:pPr>
+        <w:spacing w:after="160" w:line="276"/>
+      </w:pPr>
+      <w:r>
+        <w:rPr>
+          <w:rFonts w:ascii="Arial" w:cs="Arial" w:eastAsia="Arial" w:hAnsi="Arial"/>
+          <w:b w:val="false"/>
+          <w:bCs w:val="false"/>
+          <w:i w:val="false"/>
+          <w:iCs w:val="false"/>
+          <w:sz w:val="22"/>
+          <w:szCs w:val="22"/>
+        </w:rPr>
+        <w:t xml:space="preserve">Als mobile Ergänzung zur festen Schweißstation befasste ich mich mit der Optimierung des Schweißmaschinen-Wagens. Der Wagen soll Schweißgerät, Gasflasche und die wichtigsten Werkzeuge zum Werkstück bringen, damit nicht das Werkstück zur Maschine transportiert werden muss. Ziel war ein Wagen, auf dem jedes Werkzeug einen festen Platz hat und der die Anforderungen an Standsicherheit und Gasflaschensicherung erfüllt.</w:t>
+      </w:r>
+    </w:p>
+    <w:p>
+      <w:pPr>
+        <w:spacing w:after="160" w:line="276"/>
+      </w:pPr>
+      <w:r>
+        <w:rPr>
+          <w:rFonts w:ascii="Arial" w:cs="Arial" w:eastAsia="Arial" w:hAnsi="Arial"/>
+          <w:b w:val="false"/>
+          <w:bCs w:val="false"/>
+          <w:i w:val="false"/>
+          <w:iCs w:val="false"/>
+          <w:sz w:val="22"/>
+          <w:szCs w:val="22"/>
+        </w:rPr>
+        <w:t xml:space="preserve">Zunächst nahm ich den vorhandenen Wagen auf. Ich fotografierte ihn im Betrieb und dokumentierte seinen Zustand. Anschließend vermaß ich das Schweißgerät und die Gasflasche vor Ort und hielt die Maße in einer Handskizze fest. Aus diesen Maßen erstellte ich vereinfachte CAD-Platzhalter für Gerät und Flasche, um den benötigten Bauraum in den späteren Entwürfen realistisch abzubilden.</w:t>
       </w:r>
     </w:p>
     <w:p>
@@ -3138,7 +3120,7 @@
       <w:r>
         <w:drawing>
           <wp:inline distT="0" distB="0" distL="0" distR="0">
-            <wp:extent cx="3362325" cy="3619500"/>
+            <wp:extent cx="2714625" cy="3619500"/>
             <wp:effectExtent t="0" r="0" b="0" l="0"/>
             <wp:docPr id="1" name="" descr="" title=""/>
             <wp:cNvGraphicFramePr>
@@ -3163,7 +3145,7 @@
                   <pic:spPr bwMode="auto">
                     <a:xfrm>
                       <a:off x="0" y="0"/>
-                      <a:ext cx="3362325" cy="3619500"/>
+                      <a:ext cx="2714625" cy="3619500"/>
                     </a:xfrm>
                     <a:prstGeom prst="rect">
                       <a:avLst/>
@@ -3191,109 +3173,7 @@
           <w:sz w:val="18"/>
           <w:szCs w:val="18"/>
         </w:rPr>
-        <w:t xml:space="preserve">Abbildung 4.2: Handskizze mit dem Aufmaß von Gerät und Gasflasche</w:t>
-      </w:r>
-    </w:p>
-    <w:p>
-      <w:pPr>
-        <w:spacing w:after="160" w:line="276"/>
-      </w:pPr>
-      <w:r>
-        <w:rPr>
-          <w:rFonts w:ascii="Arial" w:cs="Arial" w:eastAsia="Arial" w:hAnsi="Arial"/>
-          <w:b w:val="false"/>
-          <w:bCs w:val="false"/>
-          <w:i w:val="false"/>
-          <w:iCs w:val="false"/>
-          <w:sz w:val="22"/>
-          <w:szCs w:val="22"/>
-        </w:rPr>
-        <w:t xml:space="preserve">Auf Basis der Aufnahme stellte ich eine Anforderungsliste auf. Ich unterschied dabei zwischen dem, was der Wagen tragen muss, und dem, was er können muss. Die Liste brachte ich auf 14 nummerierte und einzeln prüfbare Anforderungen und stimmte sie mit meinem Betreuer ab. Dadurch konnte ich jeden späteren Entwurf gegen dieselben Kriterien bewerten.</w:t>
-      </w:r>
-    </w:p>
-    <w:p>
-      <w:pPr>
-        <w:spacing w:after="160" w:line="276"/>
-      </w:pPr>
-      <w:r>
-        <w:rPr>
-          <w:rFonts w:ascii="Arial" w:cs="Arial" w:eastAsia="Arial" w:hAnsi="Arial"/>
-          <w:b w:val="false"/>
-          <w:bCs w:val="false"/>
-          <w:i w:val="false"/>
-          <w:iCs w:val="false"/>
-          <w:sz w:val="22"/>
-          <w:szCs w:val="22"/>
-        </w:rPr>
-        <w:t xml:space="preserve">Danach recherchierte ich vergleichbare Projekte und sammelte fünf mögliche Designrichtungen. Aus dieser Recherche entwickelte ich zwei erste Entwürfe im CAD und stellte sie einander gegenüber: einen schlanken Kompaktrahmen und einen breiteren Werkstattwagen mit Lochblechwänden. Der Kompaktrahmen erwies sich als kippgefährdet und bot zu wenig Ablagefläche, der Werkstattwagen war in der Grundrichtung passend, aber zu lang.</w:t>
-      </w:r>
-    </w:p>
-    <w:p>
-      <w:pPr>
-        <w:spacing w:after="160" w:line="276"/>
-      </w:pPr>
-      <w:r>
-        <w:rPr>
-          <w:rFonts w:ascii="Arial" w:cs="Arial" w:eastAsia="Arial" w:hAnsi="Arial"/>
-          <w:b w:val="false"/>
-          <w:bCs w:val="false"/>
-          <w:i w:val="false"/>
-          <w:iCs w:val="false"/>
-          <w:sz w:val="22"/>
-          <w:szCs w:val="22"/>
-        </w:rPr>
-        <w:t xml:space="preserve">Anschließend legte ich Maße und Ergonomie fest und schätzte das Gewicht des beladenen Wagens ab, um daraus die erforderliche Tragfähigkeit der Rollen abzuleiten. Auf dieser Grundlage konstruierte ich als erste Variante einen kompletten Neubau mit eigenem Gerätefach und erstellte einen Belegungsplan, der jedem der 16 vorgesehenen Werkzeuge eine feste Position zuweist.</w:t>
-      </w:r>
-    </w:p>
-    <w:p>
-      <w:pPr>
-        <w:spacing w:after="160" w:line="276"/>
-      </w:pPr>
-      <w:r>
-        <w:rPr>
-          <w:rFonts w:ascii="Arial" w:cs="Arial" w:eastAsia="Arial" w:hAnsi="Arial"/>
-          <w:b w:val="false"/>
-          <w:bCs w:val="false"/>
-          <w:i w:val="false"/>
-          <w:iCs w:val="false"/>
-          <w:sz w:val="22"/>
-          <w:szCs w:val="22"/>
-        </w:rPr>
-        <w:t xml:space="preserve">Beim Abgleich der Maße stellte ich fest, dass das geplante Gerätefach niedriger war als die vorhandene Schweißmaschine. Die Maschine hätte also nicht hineingepasst. Dieser Befund führte zu einem Konzeptwechsel: Statt eines kompletten Neubaus entwarf ich ein Aufsatzgestell, das über den vorhandenen Wagen fährt und ihn überspannt. Damit bleibt die Maschine auf ihrem angestammten Fahrgestell und der Maßkonflikt entfällt.</w:t>
-      </w:r>
-    </w:p>
-    <w:p>
-      <w:pPr>
-        <w:spacing w:after="160" w:line="276"/>
-      </w:pPr>
-      <w:r>
-        <w:rPr>
-          <w:rFonts w:ascii="Arial" w:cs="Arial" w:eastAsia="Arial" w:hAnsi="Arial"/>
-          <w:b w:val="false"/>
-          <w:bCs w:val="false"/>
-          <w:i w:val="false"/>
-          <w:iCs w:val="false"/>
-          <w:sz w:val="22"/>
-          <w:szCs w:val="22"/>
-        </w:rPr>
-        <w:t xml:space="preserve">Diese Variante überarbeitete ich in einer zweiten Version so, dass die Gasflasche innerhalb der Radaufstandsfläche steht. In der ersten Version stand sie seitlich außerhalb, was zu einer ungünstigen Lastverteilung und zu einer großen Baubreite geführt hätte.</w:t>
-      </w:r>
-    </w:p>
-    <w:p>
-      <w:pPr>
-        <w:spacing w:after="160" w:line="276"/>
-      </w:pPr>
-      <w:r>
-        <w:rPr>
-          <w:rFonts w:ascii="Arial" w:cs="Arial" w:eastAsia="Arial" w:hAnsi="Arial"/>
-          <w:b w:val="false"/>
-          <w:bCs w:val="false"/>
-          <w:i w:val="false"/>
-          <w:iCs w:val="false"/>
-          <w:sz w:val="22"/>
-          <w:szCs w:val="22"/>
-        </w:rPr>
-        <w:t xml:space="preserve">Als Vorzugsvariante legte ich schließlich einen modularen Aufbau in vier Etagen fest: unten die Aufnahme für Maschine und Bestandswagen, darüber zwei Schubladenetagen und oben ein Deckel mit anhängbarer Lochwand. Der Vorteil dieses Aufbaus liegt in der Modularität: Jede Etage ist eine eigene Baugruppe, und die beiden Schubladenetagen sind identisch, sodass nur eine Konstruktion in doppelter Stückzahl gefertigt werden muss.</w:t>
+        <w:t xml:space="preserve">Abbildung 4.1: Vorhandener Schweißwagen im Betrieb</w:t>
       </w:r>
     </w:p>
     <w:p>
@@ -3304,7 +3184,7 @@
       <w:r>
         <w:drawing>
           <wp:inline distT="0" distB="0" distL="0" distR="0">
-            <wp:extent cx="4572000" cy="3057525"/>
+            <wp:extent cx="3362325" cy="3619500"/>
             <wp:effectExtent t="0" r="0" b="0" l="0"/>
             <wp:docPr id="1" name="" descr="" title=""/>
             <wp:cNvGraphicFramePr>
@@ -3329,7 +3209,7 @@
                   <pic:spPr bwMode="auto">
                     <a:xfrm>
                       <a:off x="0" y="0"/>
-                      <a:ext cx="4572000" cy="3057525"/>
+                      <a:ext cx="3362325" cy="3619500"/>
                     </a:xfrm>
                     <a:prstGeom prst="rect">
                       <a:avLst/>
@@ -3357,24 +3237,109 @@
           <w:sz w:val="18"/>
           <w:szCs w:val="18"/>
         </w:rPr>
-        <w:t xml:space="preserve">Abbildung 4.3: Gewähltes Wagenkonzept mit Gasflaschenhalterung und mehreren Ablagen</w:t>
-      </w:r>
-    </w:p>
-    <w:p>
-      <w:pPr>
-        <w:spacing w:after="160" w:line="276"/>
-      </w:pPr>
-      <w:r>
-        <w:rPr>
-          <w:rFonts w:ascii="Arial" w:cs="Arial" w:eastAsia="Arial" w:hAnsi="Arial"/>
-          <w:b w:val="false"/>
-          <w:bCs w:val="false"/>
-          <w:i w:val="false"/>
-          <w:iCs w:val="false"/>
-          <w:sz w:val="22"/>
-          <w:szCs w:val="22"/>
-        </w:rPr>
-        <w:t xml:space="preserve">Aus dem Modell leitete ich die Zeichnungen für die Einzelteile ab, bemaßte sie und erstellte die Baugruppenzeichnungen sowie die Gesamtstückliste. Anschließend prüfte ich den Zeichnungssatz selbst. Beim Nachrechnen der Gewichte fand ich auf zwei Blättern Abweichungen zwischen der Zeichnungsangabe und dem rechnerischen Wert. Diese und weitere Befunde dokumentierte ich und ordnete sie nach Priorität, damit sie vor der Fertigung abgearbeitet werden können. Abschließend legte ich die 5S-Zuordnung der Werkzeuge auf dem Wagen fest und entwarf eine Arbeitsanweisung für das Rüsten.</w:t>
+        <w:t xml:space="preserve">Abbildung 4.2: Handskizze mit dem Aufmaß von Gerät und Gasflasche</w:t>
+      </w:r>
+    </w:p>
+    <w:p>
+      <w:pPr>
+        <w:spacing w:after="160" w:line="276"/>
+      </w:pPr>
+      <w:r>
+        <w:rPr>
+          <w:rFonts w:ascii="Arial" w:cs="Arial" w:eastAsia="Arial" w:hAnsi="Arial"/>
+          <w:b w:val="false"/>
+          <w:bCs w:val="false"/>
+          <w:i w:val="false"/>
+          <w:iCs w:val="false"/>
+          <w:sz w:val="22"/>
+          <w:szCs w:val="22"/>
+        </w:rPr>
+        <w:t xml:space="preserve">Auf Basis der Aufnahme stellte ich eine Anforderungsliste auf. Ich unterschied dabei zwischen dem, was der Wagen tragen muss, und dem, was er können muss. Die Liste brachte ich auf 14 nummerierte und einzeln prüfbare Anforderungen und stimmte sie mit meinem Betreuer ab. Dadurch konnte ich jeden späteren Entwurf gegen dieselben Kriterien bewerten.</w:t>
+      </w:r>
+    </w:p>
+    <w:p>
+      <w:pPr>
+        <w:spacing w:after="160" w:line="276"/>
+      </w:pPr>
+      <w:r>
+        <w:rPr>
+          <w:rFonts w:ascii="Arial" w:cs="Arial" w:eastAsia="Arial" w:hAnsi="Arial"/>
+          <w:b w:val="false"/>
+          <w:bCs w:val="false"/>
+          <w:i w:val="false"/>
+          <w:iCs w:val="false"/>
+          <w:sz w:val="22"/>
+          <w:szCs w:val="22"/>
+        </w:rPr>
+        <w:t xml:space="preserve">Danach recherchierte ich vergleichbare Projekte und sammelte fünf mögliche Designrichtungen. Aus dieser Recherche entwickelte ich zwei erste Entwürfe im CAD und stellte sie einander gegenüber: einen schlanken Kompaktrahmen und einen breiteren Werkstattwagen mit Lochblechwänden. Der Kompaktrahmen erwies sich als kippgefährdet und bot zu wenig Ablagefläche, der Werkstattwagen war in der Grundrichtung passend, aber zu lang.</w:t>
+      </w:r>
+    </w:p>
+    <w:p>
+      <w:pPr>
+        <w:spacing w:after="160" w:line="276"/>
+      </w:pPr>
+      <w:r>
+        <w:rPr>
+          <w:rFonts w:ascii="Arial" w:cs="Arial" w:eastAsia="Arial" w:hAnsi="Arial"/>
+          <w:b w:val="false"/>
+          <w:bCs w:val="false"/>
+          <w:i w:val="false"/>
+          <w:iCs w:val="false"/>
+          <w:sz w:val="22"/>
+          <w:szCs w:val="22"/>
+        </w:rPr>
+        <w:t xml:space="preserve">Anschließend legte ich Maße und Ergonomie fest und schätzte das Gewicht des beladenen Wagens ab, um daraus die erforderliche Tragfähigkeit der Rollen abzuleiten. Auf dieser Grundlage konstruierte ich als erste Variante einen kompletten Neubau mit eigenem Gerätefach und erstellte einen Belegungsplan, der jedem der 16 vorgesehenen Werkzeuge eine feste Position zuweist.</w:t>
+      </w:r>
+    </w:p>
+    <w:p>
+      <w:pPr>
+        <w:spacing w:after="160" w:line="276"/>
+      </w:pPr>
+      <w:r>
+        <w:rPr>
+          <w:rFonts w:ascii="Arial" w:cs="Arial" w:eastAsia="Arial" w:hAnsi="Arial"/>
+          <w:b w:val="false"/>
+          <w:bCs w:val="false"/>
+          <w:i w:val="false"/>
+          <w:iCs w:val="false"/>
+          <w:sz w:val="22"/>
+          <w:szCs w:val="22"/>
+        </w:rPr>
+        <w:t xml:space="preserve">Beim Abgleich der Maße stellte ich fest, dass das geplante Gerätefach niedriger war als die vorhandene Schweißmaschine. Die Maschine hätte also nicht hineingepasst. Dieser Befund führte zu einem Konzeptwechsel: Statt eines kompletten Neubaus entwarf ich ein Aufsatzgestell, das über den vorhandenen Wagen fährt und ihn überspannt. Damit bleibt die Maschine auf ihrem angestammten Fahrgestell und der Maßkonflikt entfällt.</w:t>
+      </w:r>
+    </w:p>
+    <w:p>
+      <w:pPr>
+        <w:spacing w:after="160" w:line="276"/>
+      </w:pPr>
+      <w:r>
+        <w:rPr>
+          <w:rFonts w:ascii="Arial" w:cs="Arial" w:eastAsia="Arial" w:hAnsi="Arial"/>
+          <w:b w:val="false"/>
+          <w:bCs w:val="false"/>
+          <w:i w:val="false"/>
+          <w:iCs w:val="false"/>
+          <w:sz w:val="22"/>
+          <w:szCs w:val="22"/>
+        </w:rPr>
+        <w:t xml:space="preserve">Diese Variante überarbeitete ich in einer zweiten Version so, dass die Gasflasche innerhalb der Radaufstandsfläche steht. In der ersten Version stand sie seitlich außerhalb, was zu einer ungünstigen Lastverteilung und zu einer großen Baubreite geführt hätte.</w:t>
+      </w:r>
+    </w:p>
+    <w:p>
+      <w:pPr>
+        <w:spacing w:after="160" w:line="276"/>
+      </w:pPr>
+      <w:r>
+        <w:rPr>
+          <w:rFonts w:ascii="Arial" w:cs="Arial" w:eastAsia="Arial" w:hAnsi="Arial"/>
+          <w:b w:val="false"/>
+          <w:bCs w:val="false"/>
+          <w:i w:val="false"/>
+          <w:iCs w:val="false"/>
+          <w:sz w:val="22"/>
+          <w:szCs w:val="22"/>
+        </w:rPr>
+        <w:t xml:space="preserve">Als Vorzugsvariante legte ich schließlich einen modularen Aufbau in vier Etagen fest: unten die Aufnahme für Maschine und Bestandswagen, darüber zwei Schubladenetagen und oben ein Deckel mit anhängbarer Lochwand. Der Vorteil dieses Aufbaus liegt in der Modularität: Jede Etage ist eine eigene Baugruppe, und die beiden Schubladenetagen sind identisch, sodass nur eine Konstruktion in doppelter Stückzahl gefertigt werden muss.</w:t>
       </w:r>
     </w:p>
     <w:p>
@@ -3385,7 +3350,7 @@
       <w:r>
         <w:drawing>
           <wp:inline distT="0" distB="0" distL="0" distR="0">
-            <wp:extent cx="2562225" cy="3619500"/>
+            <wp:extent cx="4572000" cy="3057525"/>
             <wp:effectExtent t="0" r="0" b="0" l="0"/>
             <wp:docPr id="1" name="" descr="" title=""/>
             <wp:cNvGraphicFramePr>
@@ -3410,7 +3375,7 @@
                   <pic:spPr bwMode="auto">
                     <a:xfrm>
                       <a:off x="0" y="0"/>
-                      <a:ext cx="2562225" cy="3619500"/>
+                      <a:ext cx="4572000" cy="3057525"/>
                     </a:xfrm>
                     <a:prstGeom prst="rect">
                       <a:avLst/>
@@ -3438,338 +3403,24 @@
           <w:sz w:val="18"/>
           <w:szCs w:val="18"/>
         </w:rPr>
-        <w:t xml:space="preserve">Abbildung 4.4: Zeichnungsblatt der Gesamtbaugruppe mit Stückliste</w:t>
-      </w:r>
-    </w:p>
-    <w:p>
-      <w:pPr>
-        <w:spacing w:after="160" w:line="276"/>
-      </w:pPr>
-      <w:r>
-        <w:rPr>
-          <w:rFonts w:ascii="Arial" w:cs="Arial" w:eastAsia="Arial" w:hAnsi="Arial"/>
-          <w:b w:val="false"/>
-          <w:bCs w:val="false"/>
-          <w:i w:val="false"/>
-          <w:iCs w:val="false"/>
-          <w:sz w:val="22"/>
-          <w:szCs w:val="22"/>
-        </w:rPr>
-        <w:t xml:space="preserve">Durch diese Tätigkeit lernte ich, wie wichtig eine saubere Aufnahme des Ist-Zustands ist. Der entscheidende Maßkonflikt wurde nur deshalb rechtzeitig sichtbar, weil ich Gerät und Flasche vorher real vermessen hatte. Außerdem erfuhr ich, dass ein Konzeptwechsel kein Rückschritt ist, sondern die richtige Konsequenz aus einem gemessenen Widerspruch.</w:t>
-      </w:r>
-    </w:p>
-    <w:tbl>
-      <w:tblPr>
-        <w:tblW w:type="dxa" w:w="9062"/>
-        <w:tblBorders>
-          <w:top w:val="single" w:color="000000" w:sz="6"/>
-          <w:left w:val="single" w:color="000000" w:sz="6"/>
-          <w:bottom w:val="single" w:color="000000" w:sz="6"/>
-          <w:right w:val="single" w:color="000000" w:sz="6"/>
-          <w:insideH w:val="single" w:color="auto" w:sz="4"/>
-          <w:insideV w:val="single" w:color="auto" w:sz="4"/>
-        </w:tblBorders>
-      </w:tblPr>
-      <w:tblGrid>
-        <w:gridCol w:w="9062"/>
-      </w:tblGrid>
-      <w:tr>
-        <w:tc>
-          <w:tcPr>
-            <w:tcW w:type="dxa" w:w="9062"/>
-          </w:tcPr>
-          <w:p>
-            <w:pPr>
-              <w:spacing w:after="0" w:line="276"/>
-            </w:pPr>
-            <w:r>
-              <w:rPr>
-                <w:rFonts w:ascii="Arial" w:cs="Arial" w:eastAsia="Arial" w:hAnsi="Arial"/>
-                <w:b w:val="false"/>
-                <w:bCs w:val="false"/>
-                <w:i/>
-                <w:iCs/>
-                <w:sz w:val="22"/>
-                <w:szCs w:val="22"/>
-              </w:rPr>
-              <w:t xml:space="preserve">Ende Tätigkeitsbericht 4</w:t>
-            </w:r>
-          </w:p>
-        </w:tc>
-      </w:tr>
-    </w:tbl>
-    <w:p>
-      <w:r>
-        <w:br w:type="page"/>
-      </w:r>
-    </w:p>
-    <w:tbl>
-      <w:tblPr>
-        <w:tblW w:type="dxa" w:w="9062"/>
-        <w:tblBorders>
-          <w:top w:val="none" w:color="FFFFFF" w:sz="0"/>
-          <w:left w:val="none" w:color="FFFFFF" w:sz="0"/>
-          <w:bottom w:val="none" w:color="FFFFFF" w:sz="0"/>
-          <w:right w:val="none" w:color="FFFFFF" w:sz="0"/>
-          <w:insideH w:val="single" w:color="auto" w:sz="4"/>
-          <w:insideV w:val="single" w:color="auto" w:sz="4"/>
-        </w:tblBorders>
-      </w:tblPr>
-      <w:tblGrid>
-        <w:gridCol w:w="5457"/>
-        <w:gridCol w:w="3605"/>
-      </w:tblGrid>
-      <w:tr>
-        <w:tc>
-          <w:tcPr>
-            <w:tcW w:type="dxa" w:w="9062"/>
-            <w:gridSpan w:val="2"/>
-            <w:tcBorders>
-              <w:top w:val="none" w:color="FFFFFF" w:sz="0"/>
-              <w:left w:val="none" w:color="FFFFFF" w:sz="0"/>
-              <w:bottom w:val="none" w:color="FFFFFF" w:sz="0"/>
-              <w:right w:val="none" w:color="FFFFFF" w:sz="0"/>
-            </w:tcBorders>
-            <w:shd w:fill="D9D9D9" w:val="clear"/>
-          </w:tcPr>
-          <w:p>
-            <w:pPr>
-              <w:spacing w:after="60" w:line="276"/>
-            </w:pPr>
-            <w:r>
-              <w:rPr>
-                <w:rFonts w:ascii="Arial" w:cs="Arial" w:eastAsia="Arial" w:hAnsi="Arial"/>
-                <w:b/>
-                <w:bCs/>
-                <w:i w:val="false"/>
-                <w:iCs w:val="false"/>
-                <w:sz w:val="22"/>
-                <w:szCs w:val="22"/>
-              </w:rPr>
-              <w:t xml:space="preserve">Tätigkeitsbericht 5</w:t>
-            </w:r>
-          </w:p>
-        </w:tc>
-      </w:tr>
-      <w:tr>
-        <w:tc>
-          <w:tcPr>
-            <w:tcW w:type="dxa" w:w="5457"/>
-            <w:tcBorders>
-              <w:top w:val="none" w:color="FFFFFF" w:sz="0"/>
-              <w:left w:val="none" w:color="FFFFFF" w:sz="0"/>
-              <w:bottom w:val="single" w:color="000000" w:sz="6"/>
-              <w:right w:val="none" w:color="FFFFFF" w:sz="0"/>
-            </w:tcBorders>
-          </w:tcPr>
-          <w:p>
-            <w:pPr>
-              <w:spacing w:after="20" w:line="276"/>
-            </w:pPr>
-            <w:r>
-              <w:rPr>
-                <w:rFonts w:ascii="Arial" w:cs="Arial" w:eastAsia="Arial" w:hAnsi="Arial"/>
-                <w:b w:val="false"/>
-                <w:bCs w:val="false"/>
-                <w:i w:val="false"/>
-                <w:iCs w:val="false"/>
-                <w:sz w:val="22"/>
-                <w:szCs w:val="22"/>
-              </w:rPr>
-              <w:t xml:space="preserve">Konzeption und Planung eines Zerspanarbeitsplatzes</w:t>
-            </w:r>
-          </w:p>
-        </w:tc>
-        <w:tc>
-          <w:tcPr>
-            <w:tcW w:type="dxa" w:w="3605"/>
-            <w:tcBorders>
-              <w:top w:val="none" w:color="FFFFFF" w:sz="0"/>
-              <w:left w:val="none" w:color="FFFFFF" w:sz="0"/>
-              <w:bottom w:val="single" w:color="000000" w:sz="6"/>
-              <w:right w:val="none" w:color="FFFFFF" w:sz="0"/>
-            </w:tcBorders>
-          </w:tcPr>
-          <w:p>
-            <w:pPr>
-              <w:spacing w:after="20" w:line="276"/>
-            </w:pPr>
-            <w:r>
-              <w:rPr>
-                <w:rFonts w:ascii="Arial" w:cs="Arial" w:eastAsia="Arial" w:hAnsi="Arial"/>
-                <w:b w:val="false"/>
-                <w:bCs w:val="false"/>
-                <w:i w:val="false"/>
-                <w:iCs w:val="false"/>
-                <w:sz w:val="22"/>
-                <w:szCs w:val="22"/>
-              </w:rPr>
-              <w:t xml:space="preserve">26.06.2026 – 17.07.2026</w:t>
-            </w:r>
-          </w:p>
-        </w:tc>
-      </w:tr>
-      <w:tr>
-        <w:tc>
-          <w:tcPr>
-            <w:tcW w:type="dxa" w:w="5457"/>
-            <w:tcBorders>
-              <w:top w:val="none" w:color="FFFFFF" w:sz="0"/>
-              <w:left w:val="none" w:color="FFFFFF" w:sz="0"/>
-              <w:bottom w:val="none" w:color="FFFFFF" w:sz="0"/>
-              <w:right w:val="none" w:color="FFFFFF" w:sz="0"/>
-            </w:tcBorders>
-          </w:tcPr>
-          <w:p>
-            <w:pPr>
-              <w:spacing w:after="140" w:line="276"/>
-            </w:pPr>
-            <w:r>
-              <w:rPr>
-                <w:rFonts w:ascii="Arial" w:cs="Arial" w:eastAsia="Arial" w:hAnsi="Arial"/>
-                <w:b w:val="false"/>
-                <w:bCs w:val="false"/>
-                <w:i w:val="false"/>
-                <w:iCs w:val="false"/>
-                <w:color w:val="595959"/>
-                <w:sz w:val="16"/>
-                <w:szCs w:val="16"/>
-              </w:rPr>
-              <w:t xml:space="preserve">Bezeichnung der Tätigkeit</w:t>
-            </w:r>
-          </w:p>
-        </w:tc>
-        <w:tc>
-          <w:tcPr>
-            <w:tcW w:type="dxa" w:w="3605"/>
-            <w:tcBorders>
-              <w:top w:val="none" w:color="FFFFFF" w:sz="0"/>
-              <w:left w:val="none" w:color="FFFFFF" w:sz="0"/>
-              <w:bottom w:val="none" w:color="FFFFFF" w:sz="0"/>
-              <w:right w:val="none" w:color="FFFFFF" w:sz="0"/>
-            </w:tcBorders>
-          </w:tcPr>
-          <w:p>
-            <w:pPr>
-              <w:spacing w:after="140" w:line="276"/>
-            </w:pPr>
-            <w:r>
-              <w:rPr>
-                <w:rFonts w:ascii="Arial" w:cs="Arial" w:eastAsia="Arial" w:hAnsi="Arial"/>
-                <w:b w:val="false"/>
-                <w:bCs w:val="false"/>
-                <w:i w:val="false"/>
-                <w:iCs w:val="false"/>
-                <w:color w:val="595959"/>
-                <w:sz w:val="16"/>
-                <w:szCs w:val="16"/>
-              </w:rPr>
-              <w:t xml:space="preserve">Zeitraum</w:t>
-            </w:r>
-          </w:p>
-        </w:tc>
-      </w:tr>
-    </w:tbl>
-    <w:p>
-      <w:pPr>
-        <w:spacing w:after="120" w:line="276"/>
-      </w:pPr>
-      <w:r>
-        <w:rPr>
-          <w:rFonts w:ascii="Arial" w:cs="Arial" w:eastAsia="Arial" w:hAnsi="Arial"/>
-          <w:b w:val="false"/>
-          <w:bCs w:val="false"/>
-          <w:i w:val="false"/>
-          <w:iCs w:val="false"/>
-          <w:sz w:val="22"/>
-          <w:szCs w:val="22"/>
-        </w:rPr>
-        <w:t xml:space="preserve"/>
-      </w:r>
-    </w:p>
-    <w:p>
-      <w:pPr>
-        <w:spacing w:after="160" w:line="276"/>
-      </w:pPr>
-      <w:r>
-        <w:rPr>
-          <w:rFonts w:ascii="Arial" w:cs="Arial" w:eastAsia="Arial" w:hAnsi="Arial"/>
-          <w:b w:val="false"/>
-          <w:bCs w:val="false"/>
-          <w:i w:val="false"/>
-          <w:iCs w:val="false"/>
-          <w:sz w:val="22"/>
-          <w:szCs w:val="22"/>
-        </w:rPr>
-        <w:t xml:space="preserve">Den letzten Projektabschnitt meines Praktikums bildete die Planung eines Arbeitsplatzes zum konventionellen Drehen und Fräsen. Der Platz wird von drei Personen in einer Schicht genutzt. Ziel war ein vollständig ausgestatteter Zerspanarbeitsplatz, der nach der 5S-Methode geordnet ist und für den mehrere Ausführungsvarianten technisch und wirtschaftlich verglichen werden.</w:t>
-      </w:r>
-    </w:p>
-    <w:p>
-      <w:pPr>
-        <w:spacing w:after="160" w:line="276"/>
-      </w:pPr>
-      <w:r>
-        <w:rPr>
-          <w:rFonts w:ascii="Arial" w:cs="Arial" w:eastAsia="Arial" w:hAnsi="Arial"/>
-          <w:b w:val="false"/>
-          <w:bCs w:val="false"/>
-          <w:i w:val="false"/>
-          <w:iCs w:val="false"/>
-          <w:sz w:val="22"/>
-          <w:szCs w:val="22"/>
-        </w:rPr>
-        <w:t xml:space="preserve">Zu Beginn nahm ich die Rahmenbedingungen auf. Ich besichtigte den bestehenden Bereich, fotografierte die Maschinen und die vorhandene Ausstattung und hielt fest, welche Arbeiten dort tatsächlich anfallen. Aus den Rahmenbedingungen ergaben sich bereits die ersten Festlegungen: Da drei Personen gleichzeitig arbeiten, muss personengebundenes Handwerkzeug mehrfach vorhanden sein, während die Werkbank zentral für alle drei ausgelegt wird.</w:t>
-      </w:r>
-    </w:p>
-    <w:p>
-      <w:pPr>
-        <w:spacing w:after="160" w:line="276"/>
-      </w:pPr>
-      <w:r>
-        <w:rPr>
-          <w:rFonts w:ascii="Arial" w:cs="Arial" w:eastAsia="Arial" w:hAnsi="Arial"/>
-          <w:b w:val="false"/>
-          <w:bCs w:val="false"/>
-          <w:i w:val="false"/>
-          <w:iCs w:val="false"/>
-          <w:sz w:val="22"/>
-          <w:szCs w:val="22"/>
-        </w:rPr>
-        <w:t xml:space="preserve">Anschließend stellte ich den vollständigen Werkzeugbedarf zusammen. Ich gliederte ihn nach Arbeitsschritt in sechs Gruppen: Werkzeuge zum Drehen, Werkzeuge zum Fräsen, Spann- und Aufspannmittel, Mess- und Prüfmittel, Nacharbeit sowie Hilfsmittel. Für jede Position legte ich die benötigte Menge fest und begründete sie. Messschieber, Entgratwerkzeug und Handwerkzeug führte ich dreifach, teure Einzelstücke wie Schraubstock oder Teilapparat dagegen nur einmal.</w:t>
-      </w:r>
-    </w:p>
-    <w:p>
-      <w:pPr>
-        <w:spacing w:after="160" w:line="276"/>
-      </w:pPr>
-      <w:r>
-        <w:rPr>
-          <w:rFonts w:ascii="Arial" w:cs="Arial" w:eastAsia="Arial" w:hAnsi="Arial"/>
-          <w:b w:val="false"/>
-          <w:bCs w:val="false"/>
-          <w:i w:val="false"/>
-          <w:iCs w:val="false"/>
-          <w:sz w:val="22"/>
-          <w:szCs w:val="22"/>
-        </w:rPr>
-        <w:t xml:space="preserve">Danach recherchierte ich die Preise und bepreiste die Werkzeugliste vollständig. Sie umfasst 35 Positionen. Die Kosten wertete ich nach Kategorien aus und stellte fest, dass Fräsen und Spannen zusammen knapp die Hälfte der Werkzeugkosten ausmachen, während die im Alltag ständig gebrauchte Nacharbeit die günstigste Gruppe ist.</w:t>
-      </w:r>
-    </w:p>
-    <w:p>
-      <w:pPr>
-        <w:spacing w:after="160" w:line="276"/>
-      </w:pPr>
-      <w:r>
-        <w:rPr>
-          <w:rFonts w:ascii="Arial" w:cs="Arial" w:eastAsia="Arial" w:hAnsi="Arial"/>
-          <w:b w:val="false"/>
-          <w:bCs w:val="false"/>
-          <w:i w:val="false"/>
-          <w:iCs w:val="false"/>
-          <w:sz w:val="22"/>
-          <w:szCs w:val="22"/>
-        </w:rPr>
-        <w:t xml:space="preserve">Für die Ordnung am Platz arbeitete ich ein Zonenkonzept aus. Ich ordnete jedes Werkzeug nach seiner Nutzungshäufigkeit einer von drei Zonen zu: täglich gebrauchte Werkzeuge an die Lochwand in Griffhöhe, wöchentlich gebrauchte in die Schubladen und selten gebrauchte in den Schrank. Für jede Zuordnung hielt ich die Begründung fest, damit die Ordnung später nachvollziehbar bleibt.</w:t>
+        <w:t xml:space="preserve">Abbildung 4.3: Gewähltes Wagenkonzept mit Gasflaschenhalterung und mehreren Ablagen</w:t>
+      </w:r>
+    </w:p>
+    <w:p>
+      <w:pPr>
+        <w:spacing w:after="160" w:line="276"/>
+      </w:pPr>
+      <w:r>
+        <w:rPr>
+          <w:rFonts w:ascii="Arial" w:cs="Arial" w:eastAsia="Arial" w:hAnsi="Arial"/>
+          <w:b w:val="false"/>
+          <w:bCs w:val="false"/>
+          <w:i w:val="false"/>
+          <w:iCs w:val="false"/>
+          <w:sz w:val="22"/>
+          <w:szCs w:val="22"/>
+        </w:rPr>
+        <w:t xml:space="preserve">Aus dem Modell leitete ich die Zeichnungen für die Einzelteile ab, bemaßte sie und erstellte die Baugruppenzeichnungen sowie die Gesamtstückliste. Anschließend prüfte ich den Zeichnungssatz selbst. Beim Nachrechnen der Gewichte fand ich auf zwei Blättern Abweichungen zwischen der Zeichnungsangabe und dem rechnerischen Wert. Diese und weitere Befunde dokumentierte ich und ordnete sie nach Priorität, damit sie vor der Fertigung abgearbeitet werden können. Abschließend legte ich die 5S-Zuordnung der Werkzeuge auf dem Wagen fest und entwarf eine Arbeitsanweisung für das Rüsten.</w:t>
       </w:r>
     </w:p>
     <w:p>
@@ -3780,7 +3431,7 @@
       <w:r>
         <w:drawing>
           <wp:inline distT="0" distB="0" distL="0" distR="0">
-            <wp:extent cx="4572000" cy="3333750"/>
+            <wp:extent cx="2562225" cy="3619500"/>
             <wp:effectExtent t="0" r="0" b="0" l="0"/>
             <wp:docPr id="1" name="" descr="" title=""/>
             <wp:cNvGraphicFramePr>
@@ -3805,7 +3456,7 @@
                   <pic:spPr bwMode="auto">
                     <a:xfrm>
                       <a:off x="0" y="0"/>
-                      <a:ext cx="4572000" cy="3333750"/>
+                      <a:ext cx="2562225" cy="3619500"/>
                     </a:xfrm>
                     <a:prstGeom prst="rect">
                       <a:avLst/>
@@ -3833,41 +3484,338 @@
           <w:sz w:val="18"/>
           <w:szCs w:val="18"/>
         </w:rPr>
-        <w:t xml:space="preserve">Abbildung 5.1: Gewähltes Layout-Konzept mit den Zonen A, B und C</w:t>
-      </w:r>
-    </w:p>
-    <w:p>
-      <w:pPr>
-        <w:spacing w:after="160" w:line="276"/>
-      </w:pPr>
-      <w:r>
-        <w:rPr>
-          <w:rFonts w:ascii="Arial" w:cs="Arial" w:eastAsia="Arial" w:hAnsi="Arial"/>
-          <w:b w:val="false"/>
-          <w:bCs w:val="false"/>
-          <w:i w:val="false"/>
-          <w:iCs w:val="false"/>
-          <w:sz w:val="22"/>
-          <w:szCs w:val="22"/>
-        </w:rPr>
-        <w:t xml:space="preserve">Anschließend legte ich die Grundmaße der Werkbank fest und glich sie mit den Ergonomienormen ab. Die Arbeitshöhe leitete ich aus der Ellenbogenhöhe ab, die Tiefe begrenzte ich auf 600 mm, damit die Greifwege kurz bleiben. Zusätzlich ermittelte ich den erforderlichen Beleuchtungswert für die anfallenden Arbeiten.</w:t>
-      </w:r>
-    </w:p>
-    <w:p>
-      <w:pPr>
-        <w:spacing w:after="160" w:line="276"/>
-      </w:pPr>
-      <w:r>
-        <w:rPr>
-          <w:rFonts w:ascii="Arial" w:cs="Arial" w:eastAsia="Arial" w:hAnsi="Arial"/>
-          <w:b w:val="false"/>
-          <w:bCs w:val="false"/>
-          <w:i w:val="false"/>
-          <w:iCs w:val="false"/>
-          <w:sz w:val="22"/>
-          <w:szCs w:val="22"/>
-        </w:rPr>
-        <w:t xml:space="preserve">Für den Vergleich entwickelte ich vier Bauvarianten – Aluminium-Nutprofil, Stahl-Standardwerkbank, Systemmodule und Eigenbau als Schweißkonstruktion – und stellte sie mit ihren Vor- und Nachteilen gegenüber. Unabhängig davon entwarf ich vier Layout-Konzepte für die Anordnung im Raum. Zusätzlich zeichnete ich einen maßstäblichen Werkstatt-Grundriss und prüfte darin die Freiräume an den Maschinen für Bedienung, Sicherheit und Späneabfuhr.</w:t>
+        <w:t xml:space="preserve">Abbildung 4.4: Zeichnungsblatt der Gesamtbaugruppe mit Stückliste</w:t>
+      </w:r>
+    </w:p>
+    <w:p>
+      <w:pPr>
+        <w:spacing w:after="160" w:line="276"/>
+      </w:pPr>
+      <w:r>
+        <w:rPr>
+          <w:rFonts w:ascii="Arial" w:cs="Arial" w:eastAsia="Arial" w:hAnsi="Arial"/>
+          <w:b w:val="false"/>
+          <w:bCs w:val="false"/>
+          <w:i w:val="false"/>
+          <w:iCs w:val="false"/>
+          <w:sz w:val="22"/>
+          <w:szCs w:val="22"/>
+        </w:rPr>
+        <w:t xml:space="preserve">Durch diese Tätigkeit lernte ich, wie wichtig eine saubere Aufnahme des Ist-Zustands ist. Der entscheidende Maßkonflikt wurde nur deshalb rechtzeitig sichtbar, weil ich Gerät und Flasche vorher real vermessen hatte. Außerdem erfuhr ich, dass ein Konzeptwechsel kein Rückschritt ist, sondern die richtige Konsequenz aus einem gemessenen Widerspruch.</w:t>
+      </w:r>
+    </w:p>
+    <w:tbl>
+      <w:tblPr>
+        <w:tblW w:type="dxa" w:w="9062"/>
+        <w:tblBorders>
+          <w:top w:val="single" w:color="000000" w:sz="6"/>
+          <w:left w:val="single" w:color="000000" w:sz="6"/>
+          <w:bottom w:val="single" w:color="000000" w:sz="6"/>
+          <w:right w:val="single" w:color="000000" w:sz="6"/>
+          <w:insideH w:val="single" w:color="auto" w:sz="4"/>
+          <w:insideV w:val="single" w:color="auto" w:sz="4"/>
+        </w:tblBorders>
+      </w:tblPr>
+      <w:tblGrid>
+        <w:gridCol w:w="9062"/>
+      </w:tblGrid>
+      <w:tr>
+        <w:tc>
+          <w:tcPr>
+            <w:tcW w:type="dxa" w:w="9062"/>
+          </w:tcPr>
+          <w:p>
+            <w:pPr>
+              <w:spacing w:after="0" w:line="276"/>
+            </w:pPr>
+            <w:r>
+              <w:rPr>
+                <w:rFonts w:ascii="Arial" w:cs="Arial" w:eastAsia="Arial" w:hAnsi="Arial"/>
+                <w:b w:val="false"/>
+                <w:bCs w:val="false"/>
+                <w:i/>
+                <w:iCs/>
+                <w:sz w:val="22"/>
+                <w:szCs w:val="22"/>
+              </w:rPr>
+              <w:t xml:space="preserve">Ende Tätigkeitsbericht 4</w:t>
+            </w:r>
+          </w:p>
+        </w:tc>
+      </w:tr>
+    </w:tbl>
+    <w:p>
+      <w:r>
+        <w:br w:type="page"/>
+      </w:r>
+    </w:p>
+    <w:tbl>
+      <w:tblPr>
+        <w:tblW w:type="dxa" w:w="9062"/>
+        <w:tblBorders>
+          <w:top w:val="none" w:color="FFFFFF" w:sz="0"/>
+          <w:left w:val="none" w:color="FFFFFF" w:sz="0"/>
+          <w:bottom w:val="none" w:color="FFFFFF" w:sz="0"/>
+          <w:right w:val="none" w:color="FFFFFF" w:sz="0"/>
+          <w:insideH w:val="single" w:color="auto" w:sz="4"/>
+          <w:insideV w:val="single" w:color="auto" w:sz="4"/>
+        </w:tblBorders>
+      </w:tblPr>
+      <w:tblGrid>
+        <w:gridCol w:w="5457"/>
+        <w:gridCol w:w="3605"/>
+      </w:tblGrid>
+      <w:tr>
+        <w:tc>
+          <w:tcPr>
+            <w:tcW w:type="dxa" w:w="9062"/>
+            <w:gridSpan w:val="2"/>
+            <w:tcBorders>
+              <w:top w:val="none" w:color="FFFFFF" w:sz="0"/>
+              <w:left w:val="none" w:color="FFFFFF" w:sz="0"/>
+              <w:bottom w:val="none" w:color="FFFFFF" w:sz="0"/>
+              <w:right w:val="none" w:color="FFFFFF" w:sz="0"/>
+            </w:tcBorders>
+            <w:shd w:fill="D9D9D9" w:val="clear"/>
+          </w:tcPr>
+          <w:p>
+            <w:pPr>
+              <w:spacing w:after="60" w:line="276"/>
+            </w:pPr>
+            <w:r>
+              <w:rPr>
+                <w:rFonts w:ascii="Arial" w:cs="Arial" w:eastAsia="Arial" w:hAnsi="Arial"/>
+                <w:b/>
+                <w:bCs/>
+                <w:i w:val="false"/>
+                <w:iCs w:val="false"/>
+                <w:sz w:val="22"/>
+                <w:szCs w:val="22"/>
+              </w:rPr>
+              <w:t xml:space="preserve">Tätigkeitsbericht 5</w:t>
+            </w:r>
+          </w:p>
+        </w:tc>
+      </w:tr>
+      <w:tr>
+        <w:tc>
+          <w:tcPr>
+            <w:tcW w:type="dxa" w:w="5457"/>
+            <w:tcBorders>
+              <w:top w:val="none" w:color="FFFFFF" w:sz="0"/>
+              <w:left w:val="none" w:color="FFFFFF" w:sz="0"/>
+              <w:bottom w:val="single" w:color="000000" w:sz="6"/>
+              <w:right w:val="none" w:color="FFFFFF" w:sz="0"/>
+            </w:tcBorders>
+          </w:tcPr>
+          <w:p>
+            <w:pPr>
+              <w:spacing w:after="20" w:line="276"/>
+            </w:pPr>
+            <w:r>
+              <w:rPr>
+                <w:rFonts w:ascii="Arial" w:cs="Arial" w:eastAsia="Arial" w:hAnsi="Arial"/>
+                <w:b w:val="false"/>
+                <w:bCs w:val="false"/>
+                <w:i w:val="false"/>
+                <w:iCs w:val="false"/>
+                <w:sz w:val="22"/>
+                <w:szCs w:val="22"/>
+              </w:rPr>
+              <w:t xml:space="preserve">Konzeption und Planung eines Zerspanarbeitsplatzes</w:t>
+            </w:r>
+          </w:p>
+        </w:tc>
+        <w:tc>
+          <w:tcPr>
+            <w:tcW w:type="dxa" w:w="3605"/>
+            <w:tcBorders>
+              <w:top w:val="none" w:color="FFFFFF" w:sz="0"/>
+              <w:left w:val="none" w:color="FFFFFF" w:sz="0"/>
+              <w:bottom w:val="single" w:color="000000" w:sz="6"/>
+              <w:right w:val="none" w:color="FFFFFF" w:sz="0"/>
+            </w:tcBorders>
+          </w:tcPr>
+          <w:p>
+            <w:pPr>
+              <w:spacing w:after="20" w:line="276"/>
+            </w:pPr>
+            <w:r>
+              <w:rPr>
+                <w:rFonts w:ascii="Arial" w:cs="Arial" w:eastAsia="Arial" w:hAnsi="Arial"/>
+                <w:b w:val="false"/>
+                <w:bCs w:val="false"/>
+                <w:i w:val="false"/>
+                <w:iCs w:val="false"/>
+                <w:sz w:val="22"/>
+                <w:szCs w:val="22"/>
+              </w:rPr>
+              <w:t xml:space="preserve">26.06.2026 – 17.07.2026</w:t>
+            </w:r>
+          </w:p>
+        </w:tc>
+      </w:tr>
+      <w:tr>
+        <w:tc>
+          <w:tcPr>
+            <w:tcW w:type="dxa" w:w="5457"/>
+            <w:tcBorders>
+              <w:top w:val="none" w:color="FFFFFF" w:sz="0"/>
+              <w:left w:val="none" w:color="FFFFFF" w:sz="0"/>
+              <w:bottom w:val="none" w:color="FFFFFF" w:sz="0"/>
+              <w:right w:val="none" w:color="FFFFFF" w:sz="0"/>
+            </w:tcBorders>
+          </w:tcPr>
+          <w:p>
+            <w:pPr>
+              <w:spacing w:after="140" w:line="276"/>
+            </w:pPr>
+            <w:r>
+              <w:rPr>
+                <w:rFonts w:ascii="Arial" w:cs="Arial" w:eastAsia="Arial" w:hAnsi="Arial"/>
+                <w:b w:val="false"/>
+                <w:bCs w:val="false"/>
+                <w:i w:val="false"/>
+                <w:iCs w:val="false"/>
+                <w:color w:val="595959"/>
+                <w:sz w:val="16"/>
+                <w:szCs w:val="16"/>
+              </w:rPr>
+              <w:t xml:space="preserve">Bezeichnung der Tätigkeit</w:t>
+            </w:r>
+          </w:p>
+        </w:tc>
+        <w:tc>
+          <w:tcPr>
+            <w:tcW w:type="dxa" w:w="3605"/>
+            <w:tcBorders>
+              <w:top w:val="none" w:color="FFFFFF" w:sz="0"/>
+              <w:left w:val="none" w:color="FFFFFF" w:sz="0"/>
+              <w:bottom w:val="none" w:color="FFFFFF" w:sz="0"/>
+              <w:right w:val="none" w:color="FFFFFF" w:sz="0"/>
+            </w:tcBorders>
+          </w:tcPr>
+          <w:p>
+            <w:pPr>
+              <w:spacing w:after="140" w:line="276"/>
+            </w:pPr>
+            <w:r>
+              <w:rPr>
+                <w:rFonts w:ascii="Arial" w:cs="Arial" w:eastAsia="Arial" w:hAnsi="Arial"/>
+                <w:b w:val="false"/>
+                <w:bCs w:val="false"/>
+                <w:i w:val="false"/>
+                <w:iCs w:val="false"/>
+                <w:color w:val="595959"/>
+                <w:sz w:val="16"/>
+                <w:szCs w:val="16"/>
+              </w:rPr>
+              <w:t xml:space="preserve">Zeitraum</w:t>
+            </w:r>
+          </w:p>
+        </w:tc>
+      </w:tr>
+    </w:tbl>
+    <w:p>
+      <w:pPr>
+        <w:spacing w:after="120" w:line="276"/>
+      </w:pPr>
+      <w:r>
+        <w:rPr>
+          <w:rFonts w:ascii="Arial" w:cs="Arial" w:eastAsia="Arial" w:hAnsi="Arial"/>
+          <w:b w:val="false"/>
+          <w:bCs w:val="false"/>
+          <w:i w:val="false"/>
+          <w:iCs w:val="false"/>
+          <w:sz w:val="22"/>
+          <w:szCs w:val="22"/>
+        </w:rPr>
+        <w:t xml:space="preserve"/>
+      </w:r>
+    </w:p>
+    <w:p>
+      <w:pPr>
+        <w:spacing w:after="160" w:line="276"/>
+      </w:pPr>
+      <w:r>
+        <w:rPr>
+          <w:rFonts w:ascii="Arial" w:cs="Arial" w:eastAsia="Arial" w:hAnsi="Arial"/>
+          <w:b w:val="false"/>
+          <w:bCs w:val="false"/>
+          <w:i w:val="false"/>
+          <w:iCs w:val="false"/>
+          <w:sz w:val="22"/>
+          <w:szCs w:val="22"/>
+        </w:rPr>
+        <w:t xml:space="preserve">Den letzten Projektabschnitt meines Praktikums bildete die Planung eines Arbeitsplatzes zum konventionellen Drehen und Fräsen. Der Platz wird von drei Personen in einer Schicht genutzt. Ziel war ein vollständig ausgestatteter Zerspanarbeitsplatz, der nach der 5S-Methode geordnet ist und für den mehrere Ausführungsvarianten technisch und wirtschaftlich verglichen werden.</w:t>
+      </w:r>
+    </w:p>
+    <w:p>
+      <w:pPr>
+        <w:spacing w:after="160" w:line="276"/>
+      </w:pPr>
+      <w:r>
+        <w:rPr>
+          <w:rFonts w:ascii="Arial" w:cs="Arial" w:eastAsia="Arial" w:hAnsi="Arial"/>
+          <w:b w:val="false"/>
+          <w:bCs w:val="false"/>
+          <w:i w:val="false"/>
+          <w:iCs w:val="false"/>
+          <w:sz w:val="22"/>
+          <w:szCs w:val="22"/>
+        </w:rPr>
+        <w:t xml:space="preserve">Zu Beginn nahm ich die Rahmenbedingungen auf. Ich besichtigte den bestehenden Bereich, fotografierte die Maschinen und die vorhandene Ausstattung und hielt fest, welche Arbeiten dort tatsächlich anfallen. Aus den Rahmenbedingungen ergaben sich bereits die ersten Festlegungen: Da drei Personen gleichzeitig arbeiten, muss personengebundenes Handwerkzeug mehrfach vorhanden sein, während die Werkbank zentral für alle drei ausgelegt wird.</w:t>
+      </w:r>
+    </w:p>
+    <w:p>
+      <w:pPr>
+        <w:spacing w:after="160" w:line="276"/>
+      </w:pPr>
+      <w:r>
+        <w:rPr>
+          <w:rFonts w:ascii="Arial" w:cs="Arial" w:eastAsia="Arial" w:hAnsi="Arial"/>
+          <w:b w:val="false"/>
+          <w:bCs w:val="false"/>
+          <w:i w:val="false"/>
+          <w:iCs w:val="false"/>
+          <w:sz w:val="22"/>
+          <w:szCs w:val="22"/>
+        </w:rPr>
+        <w:t xml:space="preserve">Anschließend stellte ich den vollständigen Werkzeugbedarf zusammen. Ich gliederte ihn nach Arbeitsschritt in sechs Gruppen: Werkzeuge zum Drehen, Werkzeuge zum Fräsen, Spann- und Aufspannmittel, Mess- und Prüfmittel, Nacharbeit sowie Hilfsmittel. Für jede Position legte ich die benötigte Menge fest und begründete sie. Messschieber, Entgratwerkzeug und Handwerkzeug führte ich dreifach, teure Einzelstücke wie Schraubstock oder Teilapparat dagegen nur einmal.</w:t>
+      </w:r>
+    </w:p>
+    <w:p>
+      <w:pPr>
+        <w:spacing w:after="160" w:line="276"/>
+      </w:pPr>
+      <w:r>
+        <w:rPr>
+          <w:rFonts w:ascii="Arial" w:cs="Arial" w:eastAsia="Arial" w:hAnsi="Arial"/>
+          <w:b w:val="false"/>
+          <w:bCs w:val="false"/>
+          <w:i w:val="false"/>
+          <w:iCs w:val="false"/>
+          <w:sz w:val="22"/>
+          <w:szCs w:val="22"/>
+        </w:rPr>
+        <w:t xml:space="preserve">Danach recherchierte ich die Preise und bepreiste die Werkzeugliste vollständig. Sie umfasst 35 Positionen. Die Kosten wertete ich nach Kategorien aus und stellte fest, dass Fräsen und Spannen zusammen knapp die Hälfte der Werkzeugkosten ausmachen, während die im Alltag ständig gebrauchte Nacharbeit die günstigste Gruppe ist.</w:t>
+      </w:r>
+    </w:p>
+    <w:p>
+      <w:pPr>
+        <w:spacing w:after="160" w:line="276"/>
+      </w:pPr>
+      <w:r>
+        <w:rPr>
+          <w:rFonts w:ascii="Arial" w:cs="Arial" w:eastAsia="Arial" w:hAnsi="Arial"/>
+          <w:b w:val="false"/>
+          <w:bCs w:val="false"/>
+          <w:i w:val="false"/>
+          <w:iCs w:val="false"/>
+          <w:sz w:val="22"/>
+          <w:szCs w:val="22"/>
+        </w:rPr>
+        <w:t xml:space="preserve">Für die Ordnung am Platz arbeitete ich ein Zonenkonzept aus. Ich ordnete jedes Werkzeug nach seiner Nutzungshäufigkeit einer von drei Zonen zu: täglich gebrauchte Werkzeuge an die Lochwand in Griffhöhe, wöchentlich gebrauchte in die Schubladen und selten gebrauchte in den Schrank. Für jede Zuordnung hielt ich die Begründung fest, damit die Ordnung später nachvollziehbar bleibt.</w:t>
       </w:r>
     </w:p>
     <w:p>
@@ -3878,7 +3826,7 @@
       <w:r>
         <w:drawing>
           <wp:inline distT="0" distB="0" distL="0" distR="0">
-            <wp:extent cx="4333875" cy="3619500"/>
+            <wp:extent cx="4572000" cy="3333750"/>
             <wp:effectExtent t="0" r="0" b="0" l="0"/>
             <wp:docPr id="1" name="" descr="" title=""/>
             <wp:cNvGraphicFramePr>
@@ -3903,6 +3851,104 @@
                   <pic:spPr bwMode="auto">
                     <a:xfrm>
                       <a:off x="0" y="0"/>
+                      <a:ext cx="4572000" cy="3333750"/>
+                    </a:xfrm>
+                    <a:prstGeom prst="rect">
+                      <a:avLst/>
+                    </a:prstGeom>
+                  </pic:spPr>
+                </pic:pic>
+              </a:graphicData>
+            </a:graphic>
+          </wp:inline>
+        </w:drawing>
+      </w:r>
+    </w:p>
+    <w:p>
+      <w:pPr>
+        <w:spacing w:after="240" w:line="276"/>
+        <w:jc w:val="center"/>
+      </w:pPr>
+      <w:r>
+        <w:rPr>
+          <w:rFonts w:ascii="Arial" w:cs="Arial" w:eastAsia="Arial" w:hAnsi="Arial"/>
+          <w:b w:val="false"/>
+          <w:bCs w:val="false"/>
+          <w:i w:val="false"/>
+          <w:iCs w:val="false"/>
+          <w:sz w:val="18"/>
+          <w:szCs w:val="18"/>
+        </w:rPr>
+        <w:t xml:space="preserve">Abbildung 5.1: Gewähltes Layout-Konzept mit den Zonen A, B und C</w:t>
+      </w:r>
+    </w:p>
+    <w:p>
+      <w:pPr>
+        <w:spacing w:after="160" w:line="276"/>
+      </w:pPr>
+      <w:r>
+        <w:rPr>
+          <w:rFonts w:ascii="Arial" w:cs="Arial" w:eastAsia="Arial" w:hAnsi="Arial"/>
+          <w:b w:val="false"/>
+          <w:bCs w:val="false"/>
+          <w:i w:val="false"/>
+          <w:iCs w:val="false"/>
+          <w:sz w:val="22"/>
+          <w:szCs w:val="22"/>
+        </w:rPr>
+        <w:t xml:space="preserve">Anschließend legte ich die Grundmaße der Werkbank fest und glich sie mit den Ergonomienormen ab. Die Arbeitshöhe leitete ich aus der Ellenbogenhöhe ab, die Tiefe begrenzte ich auf 600 mm, damit die Greifwege kurz bleiben. Zusätzlich ermittelte ich den erforderlichen Beleuchtungswert für die anfallenden Arbeiten.</w:t>
+      </w:r>
+    </w:p>
+    <w:p>
+      <w:pPr>
+        <w:spacing w:after="160" w:line="276"/>
+      </w:pPr>
+      <w:r>
+        <w:rPr>
+          <w:rFonts w:ascii="Arial" w:cs="Arial" w:eastAsia="Arial" w:hAnsi="Arial"/>
+          <w:b w:val="false"/>
+          <w:bCs w:val="false"/>
+          <w:i w:val="false"/>
+          <w:iCs w:val="false"/>
+          <w:sz w:val="22"/>
+          <w:szCs w:val="22"/>
+        </w:rPr>
+        <w:t xml:space="preserve">Für den Vergleich entwickelte ich vier Bauvarianten – Aluminium-Nutprofil, Stahl-Standardwerkbank, Systemmodule und Eigenbau als Schweißkonstruktion – und stellte sie mit ihren Vor- und Nachteilen gegenüber. Unabhängig davon entwarf ich vier Layout-Konzepte für die Anordnung im Raum. Zusätzlich zeichnete ich einen maßstäblichen Werkstatt-Grundriss und prüfte darin die Freiräume an den Maschinen für Bedienung, Sicherheit und Späneabfuhr.</w:t>
+      </w:r>
+    </w:p>
+    <w:p>
+      <w:pPr>
+        <w:spacing w:after="60" w:before="120"/>
+        <w:jc w:val="center"/>
+      </w:pPr>
+      <w:r>
+        <w:drawing>
+          <wp:inline distT="0" distB="0" distL="0" distR="0">
+            <wp:extent cx="4333875" cy="3619500"/>
+            <wp:effectExtent t="0" r="0" b="0" l="0"/>
+            <wp:docPr id="1" name="" descr="" title=""/>
+            <wp:cNvGraphicFramePr>
+              <a:graphicFrameLocks xmlns:a="http://schemas.openxmlformats.org/drawingml/2006/main" noChangeAspect="1"/>
+            </wp:cNvGraphicFramePr>
+            <a:graphic xmlns:a="http://schemas.openxmlformats.org/drawingml/2006/main">
+              <a:graphicData uri="http://schemas.openxmlformats.org/drawingml/2006/picture">
+                <pic:pic xmlns:pic="http://schemas.openxmlformats.org/drawingml/2006/picture">
+                  <pic:nvPicPr>
+                    <pic:cNvPr id="0" name="" descr=""/>
+                    <pic:cNvPicPr>
+                      <a:picLocks noChangeAspect="1" noChangeArrowheads="1"/>
+                    </pic:cNvPicPr>
+                  </pic:nvPicPr>
+                  <pic:blipFill>
+                    <a:blip r:embed="rId19" cstate="none"/>
+                    <a:srcRect/>
+                    <a:stretch>
+                      <a:fillRect/>
+                    </a:stretch>
+                  </pic:blipFill>
+                  <pic:spPr bwMode="auto">
+                    <a:xfrm>
+                      <a:off x="0" y="0"/>
                       <a:ext cx="4333875" cy="3619500"/>
                     </a:xfrm>
                     <a:prstGeom prst="rect">
@@ -3958,7 +4004,7 @@
                     </pic:cNvPicPr>
                   </pic:nvPicPr>
                   <pic:blipFill>
-                    <a:blip r:embed="rId19" cstate="none"/>
+                    <a:blip r:embed="rId20" cstate="none"/>
                     <a:srcRect/>
                     <a:stretch>
                       <a:fillRect/>

</xml_diff>